<commit_message>
Record decisions in place, Product Specification 1.4, document index, decision procedure
- Specification check: decisions written into the yellow rows of the original report; the separate
  "Decided" report is removed
- Product Specification updated to version 1.4 (decisions 24 to 63, Version History in Section 22);
  files renamed without the version number and every reference updated
- docs/README.md: index of every document in docs/
- CLAUDE.md: documents are updated in place; decision procedure; index kept current in the session routine
- Pull request template: "Decisions recorded" section
- Decisions Log: decisions 60 to 63; sources added to 39 to 59; decision 40 replaces the launch-languages
  part of decision 21

Co-Authored-By: Claude Opus 5.5 <noreply@anthropic.com>
Claude-Session: https://claude.ai/code/session_01LvvfiTEfqhn9xLA45B6EdW
</commit_message>
<xml_diff>
--- a/docs/reviews/2026-10-22_FindHouseQuick_Specification_Check.docx
+++ b/docs/reviews/2026-10-22_FindHouseQuick_Specification_Check.docx
@@ -72,7 +72,7 @@
           <w:sz w:val="22"/>
           <w:szCs w:val="22"/>
         </w:rPr>
-        <w:t xml:space="preserve">22 October 2026</w:t>
+        <w:t xml:space="preserve">22 October 2026. Decisions recorded 23 October 2026.</w:t>
       </w:r>
     </w:p>
     <w:p>
@@ -116,7 +116,7 @@
           <w:sz w:val="22"/>
           <w:szCs w:val="22"/>
         </w:rPr>
-        <w:t xml:space="preserve">Each finding below shows what the specification says, what is built or designed now, why it matters, and a suggestion. Nothing has been changed because of these findings. Each one waits for your decision.</w:t>
+        <w:t xml:space="preserve">Each finding shows what the specification says, what was built or designed, why it matters, and a suggestion. Emmanuel decided all 21 findings on 23 October 2026: each yellow row records the decision, the date and the number it was recorded under in the Decisions Log (finding n is decision 38 + n).</w:t>
       </w:r>
     </w:p>
     <w:p>
@@ -242,7 +242,7 @@
           <w:sz w:val="25"/>
           <w:szCs w:val="25"/>
         </w:rPr>
-        <w:t xml:space="preserve">How to use this document</w:t>
+        <w:t xml:space="preserve">How the decisions are recorded</w:t>
       </w:r>
     </w:p>
     <w:p>
@@ -260,7 +260,7 @@
           <w:sz w:val="22"/>
           <w:szCs w:val="22"/>
         </w:rPr>
-        <w:t xml:space="preserve">High priority: affects what is being built in Release 1 now, or what the records say. Medium: needed in a later Release 1 step. Low: small, or for a later release.</w:t>
+        <w:t xml:space="preserve">Each decision is in the Decisions Log (decisions 39 to 59), in both the Word and text copies.</w:t>
       </w:r>
     </w:p>
     <w:p>
@@ -278,7 +278,7 @@
           <w:sz w:val="22"/>
           <w:szCs w:val="22"/>
         </w:rPr>
-        <w:t xml:space="preserve">Write your decision in the yellow row of each finding, or simply reply in chat with the finding number and your answer.</w:t>
+        <w:t xml:space="preserve">The API design, the status note and the deployment guide were updated to match before any code depends on them.</w:t>
       </w:r>
     </w:p>
     <w:p>
@@ -296,7 +296,7 @@
           <w:sz w:val="22"/>
           <w:szCs w:val="22"/>
         </w:rPr>
-        <w:t xml:space="preserve">Each decision will be recorded in the Decisions Log, and the API design and status note updated, before any code that depends on it.</w:t>
+        <w:t xml:space="preserve">Where a decision differs from the suggestion, the yellow row says so.</w:t>
       </w:r>
     </w:p>
     <w:p>
@@ -332,7 +332,7 @@
           <w:sz w:val="22"/>
           <w:szCs w:val="22"/>
         </w:rPr>
-        <w:t xml:space="preserve">21 findings. Four are high priority: 1, 4, 5 and 8. Section 7 lists points that differ from the specification but were already settled, for completeness.</w:t>
+        <w:t xml:space="preserve">21 findings, all decided on 23 October 2026: 12 accepted as suggested, 5 accepted with specifics, 2 decided where the suggestion asked for a decision, and 2 decided differently from the suggestion (5 and 6).</w:t>
       </w:r>
     </w:p>
     <w:tbl>
@@ -349,8 +349,9 @@
       </w:tblPr>
       <w:tblGrid>
         <w:gridCol w:w="700"/>
-        <w:gridCol w:w="6300"/>
-        <w:gridCol w:w="1300"/>
+        <w:gridCol w:w="4700"/>
+        <w:gridCol w:w="1200"/>
+        <w:gridCol w:w="1700"/>
         <w:gridCol w:w="1338"/>
       </w:tblGrid>
       <w:tr>
@@ -395,7 +396,7 @@
         </w:tc>
         <w:tc>
           <w:tcPr>
-            <w:tcW w:type="dxa" w:w="6300"/>
+            <w:tcW w:type="dxa" w:w="4700"/>
             <w:tcBorders>
               <w:top w:val="single" w:color="BFBFBF" w:sz="4"/>
               <w:left w:val="single" w:color="BFBFBF" w:sz="4"/>
@@ -431,7 +432,7 @@
         </w:tc>
         <w:tc>
           <w:tcPr>
-            <w:tcW w:type="dxa" w:w="1300"/>
+            <w:tcW w:type="dxa" w:w="1200"/>
             <w:tcBorders>
               <w:top w:val="single" w:color="BFBFBF" w:sz="4"/>
               <w:left w:val="single" w:color="BFBFBF" w:sz="4"/>
@@ -461,13 +462,13 @@
                 <w:sz w:val="20"/>
                 <w:szCs w:val="20"/>
               </w:rPr>
-              <w:t xml:space="preserve">Section</w:t>
-            </w:r>
-          </w:p>
-        </w:tc>
-        <w:tc>
-          <w:tcPr>
-            <w:tcW w:type="dxa" w:w="1338"/>
+              <w:t xml:space="preserve">Priority</w:t>
+            </w:r>
+          </w:p>
+        </w:tc>
+        <w:tc>
+          <w:tcPr>
+            <w:tcW w:type="dxa" w:w="1700"/>
             <w:tcBorders>
               <w:top w:val="single" w:color="BFBFBF" w:sz="4"/>
               <w:left w:val="single" w:color="BFBFBF" w:sz="4"/>
@@ -497,7 +498,43 @@
                 <w:sz w:val="20"/>
                 <w:szCs w:val="20"/>
               </w:rPr>
-              <w:t xml:space="preserve">Priority</w:t>
+              <w:t xml:space="preserve">Decision</w:t>
+            </w:r>
+          </w:p>
+        </w:tc>
+        <w:tc>
+          <w:tcPr>
+            <w:tcW w:type="dxa" w:w="1338"/>
+            <w:tcBorders>
+              <w:top w:val="single" w:color="BFBFBF" w:sz="4"/>
+              <w:left w:val="single" w:color="BFBFBF" w:sz="4"/>
+              <w:bottom w:val="single" w:color="BFBFBF" w:sz="4"/>
+              <w:right w:val="single" w:color="BFBFBF" w:sz="4"/>
+            </w:tcBorders>
+            <w:shd w:fill="1F3864" w:color="auto" w:val="clear"/>
+            <w:tcMar>
+              <w:top w:type="dxa" w:w="60"/>
+              <w:left w:type="dxa" w:w="100"/>
+              <w:bottom w:type="dxa" w:w="60"/>
+              <w:right w:type="dxa" w:w="100"/>
+            </w:tcMar>
+          </w:tcPr>
+          <w:p>
+            <w:pPr>
+              <w:keepNext w:val="false"/>
+              <w:keepLines/>
+              <w:spacing w:after="40"/>
+            </w:pPr>
+            <w:r>
+              <w:rPr>
+                <w:rFonts w:ascii="Calibri" w:cs="Calibri" w:eastAsia="Calibri" w:hAnsi="Calibri"/>
+                <w:b/>
+                <w:bCs/>
+                <w:color w:val="FFFFFF"/>
+                <w:sz w:val="20"/>
+                <w:szCs w:val="20"/>
+              </w:rPr>
+              <w:t xml:space="preserve">Decisions Log</w:t>
             </w:r>
           </w:p>
         </w:tc>
@@ -542,7 +579,7 @@
         </w:tc>
         <w:tc>
           <w:tcPr>
-            <w:tcW w:type="dxa" w:w="6300"/>
+            <w:tcW w:type="dxa" w:w="4700"/>
             <w:tcBorders>
               <w:top w:val="single" w:color="BFBFBF" w:sz="4"/>
               <w:left w:val="single" w:color="BFBFBF" w:sz="4"/>
@@ -576,35 +613,69 @@
         </w:tc>
         <w:tc>
           <w:tcPr>
-            <w:tcW w:type="dxa" w:w="1300"/>
-            <w:tcBorders>
-              <w:top w:val="single" w:color="BFBFBF" w:sz="4"/>
-              <w:left w:val="single" w:color="BFBFBF" w:sz="4"/>
-              <w:bottom w:val="single" w:color="BFBFBF" w:sz="4"/>
-              <w:right w:val="single" w:color="BFBFBF" w:sz="4"/>
-            </w:tcBorders>
-            <w:tcMar>
-              <w:top w:type="dxa" w:w="60"/>
-              <w:left w:type="dxa" w:w="100"/>
-              <w:bottom w:type="dxa" w:w="60"/>
-              <w:right w:type="dxa" w:w="100"/>
-            </w:tcMar>
-          </w:tcPr>
-          <w:p>
-            <w:pPr>
-              <w:keepNext w:val="false"/>
-              <w:keepLines/>
-              <w:spacing w:after="40"/>
-            </w:pPr>
-            <w:r>
-              <w:rPr>
-                <w:rFonts w:ascii="Calibri" w:cs="Calibri" w:eastAsia="Calibri" w:hAnsi="Calibri"/>
-                <w:b w:val="false"/>
-                <w:bCs w:val="false"/>
-                <w:sz w:val="20"/>
-                <w:szCs w:val="20"/>
-              </w:rPr>
-              <w:t xml:space="preserve">3.1, 3.2</w:t>
+            <w:tcW w:type="dxa" w:w="1200"/>
+            <w:tcBorders>
+              <w:top w:val="single" w:color="BFBFBF" w:sz="4"/>
+              <w:left w:val="single" w:color="BFBFBF" w:sz="4"/>
+              <w:bottom w:val="single" w:color="BFBFBF" w:sz="4"/>
+              <w:right w:val="single" w:color="BFBFBF" w:sz="4"/>
+            </w:tcBorders>
+            <w:tcMar>
+              <w:top w:type="dxa" w:w="60"/>
+              <w:left w:type="dxa" w:w="100"/>
+              <w:bottom w:type="dxa" w:w="60"/>
+              <w:right w:type="dxa" w:w="100"/>
+            </w:tcMar>
+          </w:tcPr>
+          <w:p>
+            <w:pPr>
+              <w:keepNext w:val="false"/>
+              <w:keepLines/>
+              <w:spacing w:after="40"/>
+            </w:pPr>
+            <w:r>
+              <w:rPr>
+                <w:rFonts w:ascii="Calibri" w:cs="Calibri" w:eastAsia="Calibri" w:hAnsi="Calibri"/>
+                <w:b w:val="false"/>
+                <w:bCs w:val="false"/>
+                <w:sz w:val="20"/>
+                <w:szCs w:val="20"/>
+              </w:rPr>
+              <w:t xml:space="preserve">High</w:t>
+            </w:r>
+          </w:p>
+        </w:tc>
+        <w:tc>
+          <w:tcPr>
+            <w:tcW w:type="dxa" w:w="1700"/>
+            <w:tcBorders>
+              <w:top w:val="single" w:color="BFBFBF" w:sz="4"/>
+              <w:left w:val="single" w:color="BFBFBF" w:sz="4"/>
+              <w:bottom w:val="single" w:color="BFBFBF" w:sz="4"/>
+              <w:right w:val="single" w:color="BFBFBF" w:sz="4"/>
+            </w:tcBorders>
+            <w:tcMar>
+              <w:top w:type="dxa" w:w="60"/>
+              <w:left w:type="dxa" w:w="100"/>
+              <w:bottom w:type="dxa" w:w="60"/>
+              <w:right w:type="dxa" w:w="100"/>
+            </w:tcMar>
+          </w:tcPr>
+          <w:p>
+            <w:pPr>
+              <w:keepNext w:val="false"/>
+              <w:keepLines/>
+              <w:spacing w:after="40"/>
+            </w:pPr>
+            <w:r>
+              <w:rPr>
+                <w:rFonts w:ascii="Calibri" w:cs="Calibri" w:eastAsia="Calibri" w:hAnsi="Calibri"/>
+                <w:b w:val="false"/>
+                <w:bCs w:val="false"/>
+                <w:sz w:val="20"/>
+                <w:szCs w:val="20"/>
+              </w:rPr>
+              <w:t xml:space="preserve">Accepted, with these specifics</w:t>
             </w:r>
           </w:p>
         </w:tc>
@@ -638,7 +709,7 @@
                 <w:sz w:val="20"/>
                 <w:szCs w:val="20"/>
               </w:rPr>
-              <w:t xml:space="preserve">High</w:t>
+              <w:t xml:space="preserve">39</w:t>
             </w:r>
           </w:p>
         </w:tc>
@@ -683,7 +754,7 @@
         </w:tc>
         <w:tc>
           <w:tcPr>
-            <w:tcW w:type="dxa" w:w="6300"/>
+            <w:tcW w:type="dxa" w:w="4700"/>
             <w:tcBorders>
               <w:top w:val="single" w:color="BFBFBF" w:sz="4"/>
               <w:left w:val="single" w:color="BFBFBF" w:sz="4"/>
@@ -717,35 +788,69 @@
         </w:tc>
         <w:tc>
           <w:tcPr>
-            <w:tcW w:type="dxa" w:w="1300"/>
-            <w:tcBorders>
-              <w:top w:val="single" w:color="BFBFBF" w:sz="4"/>
-              <w:left w:val="single" w:color="BFBFBF" w:sz="4"/>
-              <w:bottom w:val="single" w:color="BFBFBF" w:sz="4"/>
-              <w:right w:val="single" w:color="BFBFBF" w:sz="4"/>
-            </w:tcBorders>
-            <w:tcMar>
-              <w:top w:type="dxa" w:w="60"/>
-              <w:left w:type="dxa" w:w="100"/>
-              <w:bottom w:type="dxa" w:w="60"/>
-              <w:right w:type="dxa" w:w="100"/>
-            </w:tcMar>
-          </w:tcPr>
-          <w:p>
-            <w:pPr>
-              <w:keepNext w:val="false"/>
-              <w:keepLines/>
-              <w:spacing w:after="40"/>
-            </w:pPr>
-            <w:r>
-              <w:rPr>
-                <w:rFonts w:ascii="Calibri" w:cs="Calibri" w:eastAsia="Calibri" w:hAnsi="Calibri"/>
-                <w:b w:val="false"/>
-                <w:bCs w:val="false"/>
-                <w:sz w:val="20"/>
-                <w:szCs w:val="20"/>
-              </w:rPr>
-              <w:t xml:space="preserve">18.2</w:t>
+            <w:tcW w:type="dxa" w:w="1200"/>
+            <w:tcBorders>
+              <w:top w:val="single" w:color="BFBFBF" w:sz="4"/>
+              <w:left w:val="single" w:color="BFBFBF" w:sz="4"/>
+              <w:bottom w:val="single" w:color="BFBFBF" w:sz="4"/>
+              <w:right w:val="single" w:color="BFBFBF" w:sz="4"/>
+            </w:tcBorders>
+            <w:tcMar>
+              <w:top w:type="dxa" w:w="60"/>
+              <w:left w:type="dxa" w:w="100"/>
+              <w:bottom w:type="dxa" w:w="60"/>
+              <w:right w:type="dxa" w:w="100"/>
+            </w:tcMar>
+          </w:tcPr>
+          <w:p>
+            <w:pPr>
+              <w:keepNext w:val="false"/>
+              <w:keepLines/>
+              <w:spacing w:after="40"/>
+            </w:pPr>
+            <w:r>
+              <w:rPr>
+                <w:rFonts w:ascii="Calibri" w:cs="Calibri" w:eastAsia="Calibri" w:hAnsi="Calibri"/>
+                <w:b w:val="false"/>
+                <w:bCs w:val="false"/>
+                <w:sz w:val="20"/>
+                <w:szCs w:val="20"/>
+              </w:rPr>
+              <w:t xml:space="preserve">Medium</w:t>
+            </w:r>
+          </w:p>
+        </w:tc>
+        <w:tc>
+          <w:tcPr>
+            <w:tcW w:type="dxa" w:w="1700"/>
+            <w:tcBorders>
+              <w:top w:val="single" w:color="BFBFBF" w:sz="4"/>
+              <w:left w:val="single" w:color="BFBFBF" w:sz="4"/>
+              <w:bottom w:val="single" w:color="BFBFBF" w:sz="4"/>
+              <w:right w:val="single" w:color="BFBFBF" w:sz="4"/>
+            </w:tcBorders>
+            <w:tcMar>
+              <w:top w:type="dxa" w:w="60"/>
+              <w:left w:type="dxa" w:w="100"/>
+              <w:bottom w:type="dxa" w:w="60"/>
+              <w:right w:type="dxa" w:w="100"/>
+            </w:tcMar>
+          </w:tcPr>
+          <w:p>
+            <w:pPr>
+              <w:keepNext w:val="false"/>
+              <w:keepLines/>
+              <w:spacing w:after="40"/>
+            </w:pPr>
+            <w:r>
+              <w:rPr>
+                <w:rFonts w:ascii="Calibri" w:cs="Calibri" w:eastAsia="Calibri" w:hAnsi="Calibri"/>
+                <w:b w:val="false"/>
+                <w:bCs w:val="false"/>
+                <w:sz w:val="20"/>
+                <w:szCs w:val="20"/>
+              </w:rPr>
+              <w:t xml:space="preserve">Accepted, with these specifics</w:t>
             </w:r>
           </w:p>
         </w:tc>
@@ -779,7 +884,7 @@
                 <w:sz w:val="20"/>
                 <w:szCs w:val="20"/>
               </w:rPr>
-              <w:t xml:space="preserve">Medium</w:t>
+              <w:t xml:space="preserve">40</w:t>
             </w:r>
           </w:p>
         </w:tc>
@@ -824,7 +929,7 @@
         </w:tc>
         <w:tc>
           <w:tcPr>
-            <w:tcW w:type="dxa" w:w="6300"/>
+            <w:tcW w:type="dxa" w:w="4700"/>
             <w:tcBorders>
               <w:top w:val="single" w:color="BFBFBF" w:sz="4"/>
               <w:left w:val="single" w:color="BFBFBF" w:sz="4"/>
@@ -858,35 +963,69 @@
         </w:tc>
         <w:tc>
           <w:tcPr>
-            <w:tcW w:type="dxa" w:w="1300"/>
-            <w:tcBorders>
-              <w:top w:val="single" w:color="BFBFBF" w:sz="4"/>
-              <w:left w:val="single" w:color="BFBFBF" w:sz="4"/>
-              <w:bottom w:val="single" w:color="BFBFBF" w:sz="4"/>
-              <w:right w:val="single" w:color="BFBFBF" w:sz="4"/>
-            </w:tcBorders>
-            <w:tcMar>
-              <w:top w:type="dxa" w:w="60"/>
-              <w:left w:type="dxa" w:w="100"/>
-              <w:bottom w:type="dxa" w:w="60"/>
-              <w:right w:type="dxa" w:w="100"/>
-            </w:tcMar>
-          </w:tcPr>
-          <w:p>
-            <w:pPr>
-              <w:keepNext w:val="false"/>
-              <w:keepLines/>
-              <w:spacing w:after="40"/>
-            </w:pPr>
-            <w:r>
-              <w:rPr>
-                <w:rFonts w:ascii="Calibri" w:cs="Calibri" w:eastAsia="Calibri" w:hAnsi="Calibri"/>
-                <w:b w:val="false"/>
-                <w:bCs w:val="false"/>
-                <w:sz w:val="20"/>
-                <w:szCs w:val="20"/>
-              </w:rPr>
-              <w:t xml:space="preserve">18.1</w:t>
+            <w:tcW w:type="dxa" w:w="1200"/>
+            <w:tcBorders>
+              <w:top w:val="single" w:color="BFBFBF" w:sz="4"/>
+              <w:left w:val="single" w:color="BFBFBF" w:sz="4"/>
+              <w:bottom w:val="single" w:color="BFBFBF" w:sz="4"/>
+              <w:right w:val="single" w:color="BFBFBF" w:sz="4"/>
+            </w:tcBorders>
+            <w:tcMar>
+              <w:top w:type="dxa" w:w="60"/>
+              <w:left w:type="dxa" w:w="100"/>
+              <w:bottom w:type="dxa" w:w="60"/>
+              <w:right w:type="dxa" w:w="100"/>
+            </w:tcMar>
+          </w:tcPr>
+          <w:p>
+            <w:pPr>
+              <w:keepNext w:val="false"/>
+              <w:keepLines/>
+              <w:spacing w:after="40"/>
+            </w:pPr>
+            <w:r>
+              <w:rPr>
+                <w:rFonts w:ascii="Calibri" w:cs="Calibri" w:eastAsia="Calibri" w:hAnsi="Calibri"/>
+                <w:b w:val="false"/>
+                <w:bCs w:val="false"/>
+                <w:sz w:val="20"/>
+                <w:szCs w:val="20"/>
+              </w:rPr>
+              <w:t xml:space="preserve">Medium</w:t>
+            </w:r>
+          </w:p>
+        </w:tc>
+        <w:tc>
+          <w:tcPr>
+            <w:tcW w:type="dxa" w:w="1700"/>
+            <w:tcBorders>
+              <w:top w:val="single" w:color="BFBFBF" w:sz="4"/>
+              <w:left w:val="single" w:color="BFBFBF" w:sz="4"/>
+              <w:bottom w:val="single" w:color="BFBFBF" w:sz="4"/>
+              <w:right w:val="single" w:color="BFBFBF" w:sz="4"/>
+            </w:tcBorders>
+            <w:tcMar>
+              <w:top w:type="dxa" w:w="60"/>
+              <w:left w:type="dxa" w:w="100"/>
+              <w:bottom w:type="dxa" w:w="60"/>
+              <w:right w:type="dxa" w:w="100"/>
+            </w:tcMar>
+          </w:tcPr>
+          <w:p>
+            <w:pPr>
+              <w:keepNext w:val="false"/>
+              <w:keepLines/>
+              <w:spacing w:after="40"/>
+            </w:pPr>
+            <w:r>
+              <w:rPr>
+                <w:rFonts w:ascii="Calibri" w:cs="Calibri" w:eastAsia="Calibri" w:hAnsi="Calibri"/>
+                <w:b w:val="false"/>
+                <w:bCs w:val="false"/>
+                <w:sz w:val="20"/>
+                <w:szCs w:val="20"/>
+              </w:rPr>
+              <w:t xml:space="preserve">Accepted, with these specifics</w:t>
             </w:r>
           </w:p>
         </w:tc>
@@ -920,7 +1059,7 @@
                 <w:sz w:val="20"/>
                 <w:szCs w:val="20"/>
               </w:rPr>
-              <w:t xml:space="preserve">Medium</w:t>
+              <w:t xml:space="preserve">41</w:t>
             </w:r>
           </w:p>
         </w:tc>
@@ -965,7 +1104,7 @@
         </w:tc>
         <w:tc>
           <w:tcPr>
-            <w:tcW w:type="dxa" w:w="6300"/>
+            <w:tcW w:type="dxa" w:w="4700"/>
             <w:tcBorders>
               <w:top w:val="single" w:color="BFBFBF" w:sz="4"/>
               <w:left w:val="single" w:color="BFBFBF" w:sz="4"/>
@@ -999,35 +1138,69 @@
         </w:tc>
         <w:tc>
           <w:tcPr>
-            <w:tcW w:type="dxa" w:w="1300"/>
-            <w:tcBorders>
-              <w:top w:val="single" w:color="BFBFBF" w:sz="4"/>
-              <w:left w:val="single" w:color="BFBFBF" w:sz="4"/>
-              <w:bottom w:val="single" w:color="BFBFBF" w:sz="4"/>
-              <w:right w:val="single" w:color="BFBFBF" w:sz="4"/>
-            </w:tcBorders>
-            <w:tcMar>
-              <w:top w:type="dxa" w:w="60"/>
-              <w:left w:type="dxa" w:w="100"/>
-              <w:bottom w:type="dxa" w:w="60"/>
-              <w:right w:type="dxa" w:w="100"/>
-            </w:tcMar>
-          </w:tcPr>
-          <w:p>
-            <w:pPr>
-              <w:keepNext w:val="false"/>
-              <w:keepLines/>
-              <w:spacing w:after="40"/>
-            </w:pPr>
-            <w:r>
-              <w:rPr>
-                <w:rFonts w:ascii="Calibri" w:cs="Calibri" w:eastAsia="Calibri" w:hAnsi="Calibri"/>
-                <w:b w:val="false"/>
-                <w:bCs w:val="false"/>
-                <w:sz w:val="20"/>
-                <w:szCs w:val="20"/>
-              </w:rPr>
-              <w:t xml:space="preserve">Tech. Arch. 15</w:t>
+            <w:tcW w:type="dxa" w:w="1200"/>
+            <w:tcBorders>
+              <w:top w:val="single" w:color="BFBFBF" w:sz="4"/>
+              <w:left w:val="single" w:color="BFBFBF" w:sz="4"/>
+              <w:bottom w:val="single" w:color="BFBFBF" w:sz="4"/>
+              <w:right w:val="single" w:color="BFBFBF" w:sz="4"/>
+            </w:tcBorders>
+            <w:tcMar>
+              <w:top w:type="dxa" w:w="60"/>
+              <w:left w:type="dxa" w:w="100"/>
+              <w:bottom w:type="dxa" w:w="60"/>
+              <w:right w:type="dxa" w:w="100"/>
+            </w:tcMar>
+          </w:tcPr>
+          <w:p>
+            <w:pPr>
+              <w:keepNext w:val="false"/>
+              <w:keepLines/>
+              <w:spacing w:after="40"/>
+            </w:pPr>
+            <w:r>
+              <w:rPr>
+                <w:rFonts w:ascii="Calibri" w:cs="Calibri" w:eastAsia="Calibri" w:hAnsi="Calibri"/>
+                <w:b w:val="false"/>
+                <w:bCs w:val="false"/>
+                <w:sz w:val="20"/>
+                <w:szCs w:val="20"/>
+              </w:rPr>
+              <w:t xml:space="preserve">High</w:t>
+            </w:r>
+          </w:p>
+        </w:tc>
+        <w:tc>
+          <w:tcPr>
+            <w:tcW w:type="dxa" w:w="1700"/>
+            <w:tcBorders>
+              <w:top w:val="single" w:color="BFBFBF" w:sz="4"/>
+              <w:left w:val="single" w:color="BFBFBF" w:sz="4"/>
+              <w:bottom w:val="single" w:color="BFBFBF" w:sz="4"/>
+              <w:right w:val="single" w:color="BFBFBF" w:sz="4"/>
+            </w:tcBorders>
+            <w:tcMar>
+              <w:top w:type="dxa" w:w="60"/>
+              <w:left w:type="dxa" w:w="100"/>
+              <w:bottom w:type="dxa" w:w="60"/>
+              <w:right w:type="dxa" w:w="100"/>
+            </w:tcMar>
+          </w:tcPr>
+          <w:p>
+            <w:pPr>
+              <w:keepNext w:val="false"/>
+              <w:keepLines/>
+              <w:spacing w:after="40"/>
+            </w:pPr>
+            <w:r>
+              <w:rPr>
+                <w:rFonts w:ascii="Calibri" w:cs="Calibri" w:eastAsia="Calibri" w:hAnsi="Calibri"/>
+                <w:b w:val="false"/>
+                <w:bCs w:val="false"/>
+                <w:sz w:val="20"/>
+                <w:szCs w:val="20"/>
+              </w:rPr>
+              <w:t xml:space="preserve">Decided as follows</w:t>
             </w:r>
           </w:p>
         </w:tc>
@@ -1061,7 +1234,7 @@
                 <w:sz w:val="20"/>
                 <w:szCs w:val="20"/>
               </w:rPr>
-              <w:t xml:space="preserve">High</w:t>
+              <w:t xml:space="preserve">42</w:t>
             </w:r>
           </w:p>
         </w:tc>
@@ -1106,7 +1279,7 @@
         </w:tc>
         <w:tc>
           <w:tcPr>
-            <w:tcW w:type="dxa" w:w="6300"/>
+            <w:tcW w:type="dxa" w:w="4700"/>
             <w:tcBorders>
               <w:top w:val="single" w:color="BFBFBF" w:sz="4"/>
               <w:left w:val="single" w:color="BFBFBF" w:sz="4"/>
@@ -1140,35 +1313,69 @@
         </w:tc>
         <w:tc>
           <w:tcPr>
-            <w:tcW w:type="dxa" w:w="1300"/>
-            <w:tcBorders>
-              <w:top w:val="single" w:color="BFBFBF" w:sz="4"/>
-              <w:left w:val="single" w:color="BFBFBF" w:sz="4"/>
-              <w:bottom w:val="single" w:color="BFBFBF" w:sz="4"/>
-              <w:right w:val="single" w:color="BFBFBF" w:sz="4"/>
-            </w:tcBorders>
-            <w:tcMar>
-              <w:top w:type="dxa" w:w="60"/>
-              <w:left w:type="dxa" w:w="100"/>
-              <w:bottom w:type="dxa" w:w="60"/>
-              <w:right w:type="dxa" w:w="100"/>
-            </w:tcMar>
-          </w:tcPr>
-          <w:p>
-            <w:pPr>
-              <w:keepNext w:val="false"/>
-              <w:keepLines/>
-              <w:spacing w:after="40"/>
-            </w:pPr>
-            <w:r>
-              <w:rPr>
-                <w:rFonts w:ascii="Calibri" w:cs="Calibri" w:eastAsia="Calibri" w:hAnsi="Calibri"/>
-                <w:b w:val="false"/>
-                <w:bCs w:val="false"/>
-                <w:sz w:val="20"/>
-                <w:szCs w:val="20"/>
-              </w:rPr>
-              <w:t xml:space="preserve">20; Tech. Arch. 3</w:t>
+            <w:tcW w:type="dxa" w:w="1200"/>
+            <w:tcBorders>
+              <w:top w:val="single" w:color="BFBFBF" w:sz="4"/>
+              <w:left w:val="single" w:color="BFBFBF" w:sz="4"/>
+              <w:bottom w:val="single" w:color="BFBFBF" w:sz="4"/>
+              <w:right w:val="single" w:color="BFBFBF" w:sz="4"/>
+            </w:tcBorders>
+            <w:tcMar>
+              <w:top w:type="dxa" w:w="60"/>
+              <w:left w:type="dxa" w:w="100"/>
+              <w:bottom w:type="dxa" w:w="60"/>
+              <w:right w:type="dxa" w:w="100"/>
+            </w:tcMar>
+          </w:tcPr>
+          <w:p>
+            <w:pPr>
+              <w:keepNext w:val="false"/>
+              <w:keepLines/>
+              <w:spacing w:after="40"/>
+            </w:pPr>
+            <w:r>
+              <w:rPr>
+                <w:rFonts w:ascii="Calibri" w:cs="Calibri" w:eastAsia="Calibri" w:hAnsi="Calibri"/>
+                <w:b w:val="false"/>
+                <w:bCs w:val="false"/>
+                <w:sz w:val="20"/>
+                <w:szCs w:val="20"/>
+              </w:rPr>
+              <w:t xml:space="preserve">High</w:t>
+            </w:r>
+          </w:p>
+        </w:tc>
+        <w:tc>
+          <w:tcPr>
+            <w:tcW w:type="dxa" w:w="1700"/>
+            <w:tcBorders>
+              <w:top w:val="single" w:color="BFBFBF" w:sz="4"/>
+              <w:left w:val="single" w:color="BFBFBF" w:sz="4"/>
+              <w:bottom w:val="single" w:color="BFBFBF" w:sz="4"/>
+              <w:right w:val="single" w:color="BFBFBF" w:sz="4"/>
+            </w:tcBorders>
+            <w:tcMar>
+              <w:top w:type="dxa" w:w="60"/>
+              <w:left w:type="dxa" w:w="100"/>
+              <w:bottom w:type="dxa" w:w="60"/>
+              <w:right w:type="dxa" w:w="100"/>
+            </w:tcMar>
+          </w:tcPr>
+          <w:p>
+            <w:pPr>
+              <w:keepNext w:val="false"/>
+              <w:keepLines/>
+              <w:spacing w:after="40"/>
+            </w:pPr>
+            <w:r>
+              <w:rPr>
+                <w:rFonts w:ascii="Calibri" w:cs="Calibri" w:eastAsia="Calibri" w:hAnsi="Calibri"/>
+                <w:b w:val="false"/>
+                <w:bCs w:val="false"/>
+                <w:sz w:val="20"/>
+                <w:szCs w:val="20"/>
+              </w:rPr>
+              <w:t xml:space="preserve">Decided differently from the suggestion</w:t>
             </w:r>
           </w:p>
         </w:tc>
@@ -1202,7 +1409,7 @@
                 <w:sz w:val="20"/>
                 <w:szCs w:val="20"/>
               </w:rPr>
-              <w:t xml:space="preserve">High</w:t>
+              <w:t xml:space="preserve">43</w:t>
             </w:r>
           </w:p>
         </w:tc>
@@ -1247,7 +1454,7 @@
         </w:tc>
         <w:tc>
           <w:tcPr>
-            <w:tcW w:type="dxa" w:w="6300"/>
+            <w:tcW w:type="dxa" w:w="4700"/>
             <w:tcBorders>
               <w:top w:val="single" w:color="BFBFBF" w:sz="4"/>
               <w:left w:val="single" w:color="BFBFBF" w:sz="4"/>
@@ -1281,35 +1488,69 @@
         </w:tc>
         <w:tc>
           <w:tcPr>
-            <w:tcW w:type="dxa" w:w="1300"/>
-            <w:tcBorders>
-              <w:top w:val="single" w:color="BFBFBF" w:sz="4"/>
-              <w:left w:val="single" w:color="BFBFBF" w:sz="4"/>
-              <w:bottom w:val="single" w:color="BFBFBF" w:sz="4"/>
-              <w:right w:val="single" w:color="BFBFBF" w:sz="4"/>
-            </w:tcBorders>
-            <w:tcMar>
-              <w:top w:type="dxa" w:w="60"/>
-              <w:left w:type="dxa" w:w="100"/>
-              <w:bottom w:type="dxa" w:w="60"/>
-              <w:right w:type="dxa" w:w="100"/>
-            </w:tcMar>
-          </w:tcPr>
-          <w:p>
-            <w:pPr>
-              <w:keepNext w:val="false"/>
-              <w:keepLines/>
-              <w:spacing w:after="40"/>
-            </w:pPr>
-            <w:r>
-              <w:rPr>
-                <w:rFonts w:ascii="Calibri" w:cs="Calibri" w:eastAsia="Calibri" w:hAnsi="Calibri"/>
-                <w:b w:val="false"/>
-                <w:bCs w:val="false"/>
-                <w:sz w:val="20"/>
-                <w:szCs w:val="20"/>
-              </w:rPr>
-              <w:t xml:space="preserve">7.1</w:t>
+            <w:tcW w:type="dxa" w:w="1200"/>
+            <w:tcBorders>
+              <w:top w:val="single" w:color="BFBFBF" w:sz="4"/>
+              <w:left w:val="single" w:color="BFBFBF" w:sz="4"/>
+              <w:bottom w:val="single" w:color="BFBFBF" w:sz="4"/>
+              <w:right w:val="single" w:color="BFBFBF" w:sz="4"/>
+            </w:tcBorders>
+            <w:tcMar>
+              <w:top w:type="dxa" w:w="60"/>
+              <w:left w:type="dxa" w:w="100"/>
+              <w:bottom w:type="dxa" w:w="60"/>
+              <w:right w:type="dxa" w:w="100"/>
+            </w:tcMar>
+          </w:tcPr>
+          <w:p>
+            <w:pPr>
+              <w:keepNext w:val="false"/>
+              <w:keepLines/>
+              <w:spacing w:after="40"/>
+            </w:pPr>
+            <w:r>
+              <w:rPr>
+                <w:rFonts w:ascii="Calibri" w:cs="Calibri" w:eastAsia="Calibri" w:hAnsi="Calibri"/>
+                <w:b w:val="false"/>
+                <w:bCs w:val="false"/>
+                <w:sz w:val="20"/>
+                <w:szCs w:val="20"/>
+              </w:rPr>
+              <w:t xml:space="preserve">Medium</w:t>
+            </w:r>
+          </w:p>
+        </w:tc>
+        <w:tc>
+          <w:tcPr>
+            <w:tcW w:type="dxa" w:w="1700"/>
+            <w:tcBorders>
+              <w:top w:val="single" w:color="BFBFBF" w:sz="4"/>
+              <w:left w:val="single" w:color="BFBFBF" w:sz="4"/>
+              <w:bottom w:val="single" w:color="BFBFBF" w:sz="4"/>
+              <w:right w:val="single" w:color="BFBFBF" w:sz="4"/>
+            </w:tcBorders>
+            <w:tcMar>
+              <w:top w:type="dxa" w:w="60"/>
+              <w:left w:type="dxa" w:w="100"/>
+              <w:bottom w:type="dxa" w:w="60"/>
+              <w:right w:type="dxa" w:w="100"/>
+            </w:tcMar>
+          </w:tcPr>
+          <w:p>
+            <w:pPr>
+              <w:keepNext w:val="false"/>
+              <w:keepLines/>
+              <w:spacing w:after="40"/>
+            </w:pPr>
+            <w:r>
+              <w:rPr>
+                <w:rFonts w:ascii="Calibri" w:cs="Calibri" w:eastAsia="Calibri" w:hAnsi="Calibri"/>
+                <w:b w:val="false"/>
+                <w:bCs w:val="false"/>
+                <w:sz w:val="20"/>
+                <w:szCs w:val="20"/>
+              </w:rPr>
+              <w:t xml:space="preserve">Decided differently from the suggestion</w:t>
             </w:r>
           </w:p>
         </w:tc>
@@ -1343,7 +1584,7 @@
                 <w:sz w:val="20"/>
                 <w:szCs w:val="20"/>
               </w:rPr>
-              <w:t xml:space="preserve">Medium</w:t>
+              <w:t xml:space="preserve">44</w:t>
             </w:r>
           </w:p>
         </w:tc>
@@ -1388,7 +1629,7 @@
         </w:tc>
         <w:tc>
           <w:tcPr>
-            <w:tcW w:type="dxa" w:w="6300"/>
+            <w:tcW w:type="dxa" w:w="4700"/>
             <w:tcBorders>
               <w:top w:val="single" w:color="BFBFBF" w:sz="4"/>
               <w:left w:val="single" w:color="BFBFBF" w:sz="4"/>
@@ -1422,35 +1663,69 @@
         </w:tc>
         <w:tc>
           <w:tcPr>
-            <w:tcW w:type="dxa" w:w="1300"/>
-            <w:tcBorders>
-              <w:top w:val="single" w:color="BFBFBF" w:sz="4"/>
-              <w:left w:val="single" w:color="BFBFBF" w:sz="4"/>
-              <w:bottom w:val="single" w:color="BFBFBF" w:sz="4"/>
-              <w:right w:val="single" w:color="BFBFBF" w:sz="4"/>
-            </w:tcBorders>
-            <w:tcMar>
-              <w:top w:type="dxa" w:w="60"/>
-              <w:left w:type="dxa" w:w="100"/>
-              <w:bottom w:type="dxa" w:w="60"/>
-              <w:right w:type="dxa" w:w="100"/>
-            </w:tcMar>
-          </w:tcPr>
-          <w:p>
-            <w:pPr>
-              <w:keepNext w:val="false"/>
-              <w:keepLines/>
-              <w:spacing w:after="40"/>
-            </w:pPr>
-            <w:r>
-              <w:rPr>
-                <w:rFonts w:ascii="Calibri" w:cs="Calibri" w:eastAsia="Calibri" w:hAnsi="Calibri"/>
-                <w:b w:val="false"/>
-                <w:bCs w:val="false"/>
-                <w:sz w:val="20"/>
-                <w:szCs w:val="20"/>
-              </w:rPr>
-              <w:t xml:space="preserve">7.2</w:t>
+            <w:tcW w:type="dxa" w:w="1200"/>
+            <w:tcBorders>
+              <w:top w:val="single" w:color="BFBFBF" w:sz="4"/>
+              <w:left w:val="single" w:color="BFBFBF" w:sz="4"/>
+              <w:bottom w:val="single" w:color="BFBFBF" w:sz="4"/>
+              <w:right w:val="single" w:color="BFBFBF" w:sz="4"/>
+            </w:tcBorders>
+            <w:tcMar>
+              <w:top w:type="dxa" w:w="60"/>
+              <w:left w:type="dxa" w:w="100"/>
+              <w:bottom w:type="dxa" w:w="60"/>
+              <w:right w:type="dxa" w:w="100"/>
+            </w:tcMar>
+          </w:tcPr>
+          <w:p>
+            <w:pPr>
+              <w:keepNext w:val="false"/>
+              <w:keepLines/>
+              <w:spacing w:after="40"/>
+            </w:pPr>
+            <w:r>
+              <w:rPr>
+                <w:rFonts w:ascii="Calibri" w:cs="Calibri" w:eastAsia="Calibri" w:hAnsi="Calibri"/>
+                <w:b w:val="false"/>
+                <w:bCs w:val="false"/>
+                <w:sz w:val="20"/>
+                <w:szCs w:val="20"/>
+              </w:rPr>
+              <w:t xml:space="preserve">Low</w:t>
+            </w:r>
+          </w:p>
+        </w:tc>
+        <w:tc>
+          <w:tcPr>
+            <w:tcW w:type="dxa" w:w="1700"/>
+            <w:tcBorders>
+              <w:top w:val="single" w:color="BFBFBF" w:sz="4"/>
+              <w:left w:val="single" w:color="BFBFBF" w:sz="4"/>
+              <w:bottom w:val="single" w:color="BFBFBF" w:sz="4"/>
+              <w:right w:val="single" w:color="BFBFBF" w:sz="4"/>
+            </w:tcBorders>
+            <w:tcMar>
+              <w:top w:type="dxa" w:w="60"/>
+              <w:left w:type="dxa" w:w="100"/>
+              <w:bottom w:type="dxa" w:w="60"/>
+              <w:right w:type="dxa" w:w="100"/>
+            </w:tcMar>
+          </w:tcPr>
+          <w:p>
+            <w:pPr>
+              <w:keepNext w:val="false"/>
+              <w:keepLines/>
+              <w:spacing w:after="40"/>
+            </w:pPr>
+            <w:r>
+              <w:rPr>
+                <w:rFonts w:ascii="Calibri" w:cs="Calibri" w:eastAsia="Calibri" w:hAnsi="Calibri"/>
+                <w:b w:val="false"/>
+                <w:bCs w:val="false"/>
+                <w:sz w:val="20"/>
+                <w:szCs w:val="20"/>
+              </w:rPr>
+              <w:t xml:space="preserve">Accepted as suggested</w:t>
             </w:r>
           </w:p>
         </w:tc>
@@ -1484,7 +1759,7 @@
                 <w:sz w:val="20"/>
                 <w:szCs w:val="20"/>
               </w:rPr>
-              <w:t xml:space="preserve">Low</w:t>
+              <w:t xml:space="preserve">45</w:t>
             </w:r>
           </w:p>
         </w:tc>
@@ -1529,7 +1804,7 @@
         </w:tc>
         <w:tc>
           <w:tcPr>
-            <w:tcW w:type="dxa" w:w="6300"/>
+            <w:tcW w:type="dxa" w:w="4700"/>
             <w:tcBorders>
               <w:top w:val="single" w:color="BFBFBF" w:sz="4"/>
               <w:left w:val="single" w:color="BFBFBF" w:sz="4"/>
@@ -1563,35 +1838,69 @@
         </w:tc>
         <w:tc>
           <w:tcPr>
-            <w:tcW w:type="dxa" w:w="1300"/>
-            <w:tcBorders>
-              <w:top w:val="single" w:color="BFBFBF" w:sz="4"/>
-              <w:left w:val="single" w:color="BFBFBF" w:sz="4"/>
-              <w:bottom w:val="single" w:color="BFBFBF" w:sz="4"/>
-              <w:right w:val="single" w:color="BFBFBF" w:sz="4"/>
-            </w:tcBorders>
-            <w:tcMar>
-              <w:top w:type="dxa" w:w="60"/>
-              <w:left w:type="dxa" w:w="100"/>
-              <w:bottom w:type="dxa" w:w="60"/>
-              <w:right w:type="dxa" w:w="100"/>
-            </w:tcMar>
-          </w:tcPr>
-          <w:p>
-            <w:pPr>
-              <w:keepNext w:val="false"/>
-              <w:keepLines/>
-              <w:spacing w:after="40"/>
-            </w:pPr>
-            <w:r>
-              <w:rPr>
-                <w:rFonts w:ascii="Calibri" w:cs="Calibri" w:eastAsia="Calibri" w:hAnsi="Calibri"/>
-                <w:b w:val="false"/>
-                <w:bCs w:val="false"/>
-                <w:sz w:val="20"/>
-                <w:szCs w:val="20"/>
-              </w:rPr>
-              <w:t xml:space="preserve">4.2, 7, 11</w:t>
+            <w:tcW w:type="dxa" w:w="1200"/>
+            <w:tcBorders>
+              <w:top w:val="single" w:color="BFBFBF" w:sz="4"/>
+              <w:left w:val="single" w:color="BFBFBF" w:sz="4"/>
+              <w:bottom w:val="single" w:color="BFBFBF" w:sz="4"/>
+              <w:right w:val="single" w:color="BFBFBF" w:sz="4"/>
+            </w:tcBorders>
+            <w:tcMar>
+              <w:top w:type="dxa" w:w="60"/>
+              <w:left w:type="dxa" w:w="100"/>
+              <w:bottom w:type="dxa" w:w="60"/>
+              <w:right w:type="dxa" w:w="100"/>
+            </w:tcMar>
+          </w:tcPr>
+          <w:p>
+            <w:pPr>
+              <w:keepNext w:val="false"/>
+              <w:keepLines/>
+              <w:spacing w:after="40"/>
+            </w:pPr>
+            <w:r>
+              <w:rPr>
+                <w:rFonts w:ascii="Calibri" w:cs="Calibri" w:eastAsia="Calibri" w:hAnsi="Calibri"/>
+                <w:b w:val="false"/>
+                <w:bCs w:val="false"/>
+                <w:sz w:val="20"/>
+                <w:szCs w:val="20"/>
+              </w:rPr>
+              <w:t xml:space="preserve">High</w:t>
+            </w:r>
+          </w:p>
+        </w:tc>
+        <w:tc>
+          <w:tcPr>
+            <w:tcW w:type="dxa" w:w="1700"/>
+            <w:tcBorders>
+              <w:top w:val="single" w:color="BFBFBF" w:sz="4"/>
+              <w:left w:val="single" w:color="BFBFBF" w:sz="4"/>
+              <w:bottom w:val="single" w:color="BFBFBF" w:sz="4"/>
+              <w:right w:val="single" w:color="BFBFBF" w:sz="4"/>
+            </w:tcBorders>
+            <w:tcMar>
+              <w:top w:type="dxa" w:w="60"/>
+              <w:left w:type="dxa" w:w="100"/>
+              <w:bottom w:type="dxa" w:w="60"/>
+              <w:right w:type="dxa" w:w="100"/>
+            </w:tcMar>
+          </w:tcPr>
+          <w:p>
+            <w:pPr>
+              <w:keepNext w:val="false"/>
+              <w:keepLines/>
+              <w:spacing w:after="40"/>
+            </w:pPr>
+            <w:r>
+              <w:rPr>
+                <w:rFonts w:ascii="Calibri" w:cs="Calibri" w:eastAsia="Calibri" w:hAnsi="Calibri"/>
+                <w:b w:val="false"/>
+                <w:bCs w:val="false"/>
+                <w:sz w:val="20"/>
+                <w:szCs w:val="20"/>
+              </w:rPr>
+              <w:t xml:space="preserve">Accepted as suggested</w:t>
             </w:r>
           </w:p>
         </w:tc>
@@ -1625,7 +1934,7 @@
                 <w:sz w:val="20"/>
                 <w:szCs w:val="20"/>
               </w:rPr>
-              <w:t xml:space="preserve">High</w:t>
+              <w:t xml:space="preserve">46</w:t>
             </w:r>
           </w:p>
         </w:tc>
@@ -1670,7 +1979,7 @@
         </w:tc>
         <w:tc>
           <w:tcPr>
-            <w:tcW w:type="dxa" w:w="6300"/>
+            <w:tcW w:type="dxa" w:w="4700"/>
             <w:tcBorders>
               <w:top w:val="single" w:color="BFBFBF" w:sz="4"/>
               <w:left w:val="single" w:color="BFBFBF" w:sz="4"/>
@@ -1704,35 +2013,69 @@
         </w:tc>
         <w:tc>
           <w:tcPr>
-            <w:tcW w:type="dxa" w:w="1300"/>
-            <w:tcBorders>
-              <w:top w:val="single" w:color="BFBFBF" w:sz="4"/>
-              <w:left w:val="single" w:color="BFBFBF" w:sz="4"/>
-              <w:bottom w:val="single" w:color="BFBFBF" w:sz="4"/>
-              <w:right w:val="single" w:color="BFBFBF" w:sz="4"/>
-            </w:tcBorders>
-            <w:tcMar>
-              <w:top w:type="dxa" w:w="60"/>
-              <w:left w:type="dxa" w:w="100"/>
-              <w:bottom w:type="dxa" w:w="60"/>
-              <w:right w:type="dxa" w:w="100"/>
-            </w:tcMar>
-          </w:tcPr>
-          <w:p>
-            <w:pPr>
-              <w:keepNext w:val="false"/>
-              <w:keepLines/>
-              <w:spacing w:after="40"/>
-            </w:pPr>
-            <w:r>
-              <w:rPr>
-                <w:rFonts w:ascii="Calibri" w:cs="Calibri" w:eastAsia="Calibri" w:hAnsi="Calibri"/>
-                <w:b w:val="false"/>
-                <w:bCs w:val="false"/>
-                <w:sz w:val="20"/>
-                <w:szCs w:val="20"/>
-              </w:rPr>
-              <w:t xml:space="preserve">1.4; Tech. Arch. 9.1</w:t>
+            <w:tcW w:type="dxa" w:w="1200"/>
+            <w:tcBorders>
+              <w:top w:val="single" w:color="BFBFBF" w:sz="4"/>
+              <w:left w:val="single" w:color="BFBFBF" w:sz="4"/>
+              <w:bottom w:val="single" w:color="BFBFBF" w:sz="4"/>
+              <w:right w:val="single" w:color="BFBFBF" w:sz="4"/>
+            </w:tcBorders>
+            <w:tcMar>
+              <w:top w:type="dxa" w:w="60"/>
+              <w:left w:type="dxa" w:w="100"/>
+              <w:bottom w:type="dxa" w:w="60"/>
+              <w:right w:type="dxa" w:w="100"/>
+            </w:tcMar>
+          </w:tcPr>
+          <w:p>
+            <w:pPr>
+              <w:keepNext w:val="false"/>
+              <w:keepLines/>
+              <w:spacing w:after="40"/>
+            </w:pPr>
+            <w:r>
+              <w:rPr>
+                <w:rFonts w:ascii="Calibri" w:cs="Calibri" w:eastAsia="Calibri" w:hAnsi="Calibri"/>
+                <w:b w:val="false"/>
+                <w:bCs w:val="false"/>
+                <w:sz w:val="20"/>
+                <w:szCs w:val="20"/>
+              </w:rPr>
+              <w:t xml:space="preserve">Medium</w:t>
+            </w:r>
+          </w:p>
+        </w:tc>
+        <w:tc>
+          <w:tcPr>
+            <w:tcW w:type="dxa" w:w="1700"/>
+            <w:tcBorders>
+              <w:top w:val="single" w:color="BFBFBF" w:sz="4"/>
+              <w:left w:val="single" w:color="BFBFBF" w:sz="4"/>
+              <w:bottom w:val="single" w:color="BFBFBF" w:sz="4"/>
+              <w:right w:val="single" w:color="BFBFBF" w:sz="4"/>
+            </w:tcBorders>
+            <w:tcMar>
+              <w:top w:type="dxa" w:w="60"/>
+              <w:left w:type="dxa" w:w="100"/>
+              <w:bottom w:type="dxa" w:w="60"/>
+              <w:right w:type="dxa" w:w="100"/>
+            </w:tcMar>
+          </w:tcPr>
+          <w:p>
+            <w:pPr>
+              <w:keepNext w:val="false"/>
+              <w:keepLines/>
+              <w:spacing w:after="40"/>
+            </w:pPr>
+            <w:r>
+              <w:rPr>
+                <w:rFonts w:ascii="Calibri" w:cs="Calibri" w:eastAsia="Calibri" w:hAnsi="Calibri"/>
+                <w:b w:val="false"/>
+                <w:bCs w:val="false"/>
+                <w:sz w:val="20"/>
+                <w:szCs w:val="20"/>
+              </w:rPr>
+              <w:t xml:space="preserve">Accepted as suggested</w:t>
             </w:r>
           </w:p>
         </w:tc>
@@ -1766,7 +2109,7 @@
                 <w:sz w:val="20"/>
                 <w:szCs w:val="20"/>
               </w:rPr>
-              <w:t xml:space="preserve">Medium</w:t>
+              <w:t xml:space="preserve">47</w:t>
             </w:r>
           </w:p>
         </w:tc>
@@ -1811,7 +2154,7 @@
         </w:tc>
         <w:tc>
           <w:tcPr>
-            <w:tcW w:type="dxa" w:w="6300"/>
+            <w:tcW w:type="dxa" w:w="4700"/>
             <w:tcBorders>
               <w:top w:val="single" w:color="BFBFBF" w:sz="4"/>
               <w:left w:val="single" w:color="BFBFBF" w:sz="4"/>
@@ -1845,35 +2188,69 @@
         </w:tc>
         <w:tc>
           <w:tcPr>
-            <w:tcW w:type="dxa" w:w="1300"/>
-            <w:tcBorders>
-              <w:top w:val="single" w:color="BFBFBF" w:sz="4"/>
-              <w:left w:val="single" w:color="BFBFBF" w:sz="4"/>
-              <w:bottom w:val="single" w:color="BFBFBF" w:sz="4"/>
-              <w:right w:val="single" w:color="BFBFBF" w:sz="4"/>
-            </w:tcBorders>
-            <w:tcMar>
-              <w:top w:type="dxa" w:w="60"/>
-              <w:left w:type="dxa" w:w="100"/>
-              <w:bottom w:type="dxa" w:w="60"/>
-              <w:right w:type="dxa" w:w="100"/>
-            </w:tcMar>
-          </w:tcPr>
-          <w:p>
-            <w:pPr>
-              <w:keepNext w:val="false"/>
-              <w:keepLines/>
-              <w:spacing w:after="40"/>
-            </w:pPr>
-            <w:r>
-              <w:rPr>
-                <w:rFonts w:ascii="Calibri" w:cs="Calibri" w:eastAsia="Calibri" w:hAnsi="Calibri"/>
-                <w:b w:val="false"/>
-                <w:bCs w:val="false"/>
-                <w:sz w:val="20"/>
-                <w:szCs w:val="20"/>
-              </w:rPr>
-              <w:t xml:space="preserve">5.4, 15.2</w:t>
+            <w:tcW w:type="dxa" w:w="1200"/>
+            <w:tcBorders>
+              <w:top w:val="single" w:color="BFBFBF" w:sz="4"/>
+              <w:left w:val="single" w:color="BFBFBF" w:sz="4"/>
+              <w:bottom w:val="single" w:color="BFBFBF" w:sz="4"/>
+              <w:right w:val="single" w:color="BFBFBF" w:sz="4"/>
+            </w:tcBorders>
+            <w:tcMar>
+              <w:top w:type="dxa" w:w="60"/>
+              <w:left w:type="dxa" w:w="100"/>
+              <w:bottom w:type="dxa" w:w="60"/>
+              <w:right w:type="dxa" w:w="100"/>
+            </w:tcMar>
+          </w:tcPr>
+          <w:p>
+            <w:pPr>
+              <w:keepNext w:val="false"/>
+              <w:keepLines/>
+              <w:spacing w:after="40"/>
+            </w:pPr>
+            <w:r>
+              <w:rPr>
+                <w:rFonts w:ascii="Calibri" w:cs="Calibri" w:eastAsia="Calibri" w:hAnsi="Calibri"/>
+                <w:b w:val="false"/>
+                <w:bCs w:val="false"/>
+                <w:sz w:val="20"/>
+                <w:szCs w:val="20"/>
+              </w:rPr>
+              <w:t xml:space="preserve">Low</w:t>
+            </w:r>
+          </w:p>
+        </w:tc>
+        <w:tc>
+          <w:tcPr>
+            <w:tcW w:type="dxa" w:w="1700"/>
+            <w:tcBorders>
+              <w:top w:val="single" w:color="BFBFBF" w:sz="4"/>
+              <w:left w:val="single" w:color="BFBFBF" w:sz="4"/>
+              <w:bottom w:val="single" w:color="BFBFBF" w:sz="4"/>
+              <w:right w:val="single" w:color="BFBFBF" w:sz="4"/>
+            </w:tcBorders>
+            <w:tcMar>
+              <w:top w:type="dxa" w:w="60"/>
+              <w:left w:type="dxa" w:w="100"/>
+              <w:bottom w:type="dxa" w:w="60"/>
+              <w:right w:type="dxa" w:w="100"/>
+            </w:tcMar>
+          </w:tcPr>
+          <w:p>
+            <w:pPr>
+              <w:keepNext w:val="false"/>
+              <w:keepLines/>
+              <w:spacing w:after="40"/>
+            </w:pPr>
+            <w:r>
+              <w:rPr>
+                <w:rFonts w:ascii="Calibri" w:cs="Calibri" w:eastAsia="Calibri" w:hAnsi="Calibri"/>
+                <w:b w:val="false"/>
+                <w:bCs w:val="false"/>
+                <w:sz w:val="20"/>
+                <w:szCs w:val="20"/>
+              </w:rPr>
+              <w:t xml:space="preserve">Accepted as suggested</w:t>
             </w:r>
           </w:p>
         </w:tc>
@@ -1907,7 +2284,7 @@
                 <w:sz w:val="20"/>
                 <w:szCs w:val="20"/>
               </w:rPr>
-              <w:t xml:space="preserve">Low</w:t>
+              <w:t xml:space="preserve">48</w:t>
             </w:r>
           </w:p>
         </w:tc>
@@ -1952,7 +2329,7 @@
         </w:tc>
         <w:tc>
           <w:tcPr>
-            <w:tcW w:type="dxa" w:w="6300"/>
+            <w:tcW w:type="dxa" w:w="4700"/>
             <w:tcBorders>
               <w:top w:val="single" w:color="BFBFBF" w:sz="4"/>
               <w:left w:val="single" w:color="BFBFBF" w:sz="4"/>
@@ -1986,35 +2363,69 @@
         </w:tc>
         <w:tc>
           <w:tcPr>
-            <w:tcW w:type="dxa" w:w="1300"/>
-            <w:tcBorders>
-              <w:top w:val="single" w:color="BFBFBF" w:sz="4"/>
-              <w:left w:val="single" w:color="BFBFBF" w:sz="4"/>
-              <w:bottom w:val="single" w:color="BFBFBF" w:sz="4"/>
-              <w:right w:val="single" w:color="BFBFBF" w:sz="4"/>
-            </w:tcBorders>
-            <w:tcMar>
-              <w:top w:type="dxa" w:w="60"/>
-              <w:left w:type="dxa" w:w="100"/>
-              <w:bottom w:type="dxa" w:w="60"/>
-              <w:right w:type="dxa" w:w="100"/>
-            </w:tcMar>
-          </w:tcPr>
-          <w:p>
-            <w:pPr>
-              <w:keepNext w:val="false"/>
-              <w:keepLines/>
-              <w:spacing w:after="40"/>
-            </w:pPr>
-            <w:r>
-              <w:rPr>
-                <w:rFonts w:ascii="Calibri" w:cs="Calibri" w:eastAsia="Calibri" w:hAnsi="Calibri"/>
-                <w:b w:val="false"/>
-                <w:bCs w:val="false"/>
-                <w:sz w:val="20"/>
-                <w:szCs w:val="20"/>
-              </w:rPr>
-              <w:t xml:space="preserve">3.2 to 3.4</w:t>
+            <w:tcW w:type="dxa" w:w="1200"/>
+            <w:tcBorders>
+              <w:top w:val="single" w:color="BFBFBF" w:sz="4"/>
+              <w:left w:val="single" w:color="BFBFBF" w:sz="4"/>
+              <w:bottom w:val="single" w:color="BFBFBF" w:sz="4"/>
+              <w:right w:val="single" w:color="BFBFBF" w:sz="4"/>
+            </w:tcBorders>
+            <w:tcMar>
+              <w:top w:type="dxa" w:w="60"/>
+              <w:left w:type="dxa" w:w="100"/>
+              <w:bottom w:type="dxa" w:w="60"/>
+              <w:right w:type="dxa" w:w="100"/>
+            </w:tcMar>
+          </w:tcPr>
+          <w:p>
+            <w:pPr>
+              <w:keepNext w:val="false"/>
+              <w:keepLines/>
+              <w:spacing w:after="40"/>
+            </w:pPr>
+            <w:r>
+              <w:rPr>
+                <w:rFonts w:ascii="Calibri" w:cs="Calibri" w:eastAsia="Calibri" w:hAnsi="Calibri"/>
+                <w:b w:val="false"/>
+                <w:bCs w:val="false"/>
+                <w:sz w:val="20"/>
+                <w:szCs w:val="20"/>
+              </w:rPr>
+              <w:t xml:space="preserve">Medium</w:t>
+            </w:r>
+          </w:p>
+        </w:tc>
+        <w:tc>
+          <w:tcPr>
+            <w:tcW w:type="dxa" w:w="1700"/>
+            <w:tcBorders>
+              <w:top w:val="single" w:color="BFBFBF" w:sz="4"/>
+              <w:left w:val="single" w:color="BFBFBF" w:sz="4"/>
+              <w:bottom w:val="single" w:color="BFBFBF" w:sz="4"/>
+              <w:right w:val="single" w:color="BFBFBF" w:sz="4"/>
+            </w:tcBorders>
+            <w:tcMar>
+              <w:top w:type="dxa" w:w="60"/>
+              <w:left w:type="dxa" w:w="100"/>
+              <w:bottom w:type="dxa" w:w="60"/>
+              <w:right w:type="dxa" w:w="100"/>
+            </w:tcMar>
+          </w:tcPr>
+          <w:p>
+            <w:pPr>
+              <w:keepNext w:val="false"/>
+              <w:keepLines/>
+              <w:spacing w:after="40"/>
+            </w:pPr>
+            <w:r>
+              <w:rPr>
+                <w:rFonts w:ascii="Calibri" w:cs="Calibri" w:eastAsia="Calibri" w:hAnsi="Calibri"/>
+                <w:b w:val="false"/>
+                <w:bCs w:val="false"/>
+                <w:sz w:val="20"/>
+                <w:szCs w:val="20"/>
+              </w:rPr>
+              <w:t xml:space="preserve">Decided as follows</w:t>
             </w:r>
           </w:p>
         </w:tc>
@@ -2048,7 +2459,7 @@
                 <w:sz w:val="20"/>
                 <w:szCs w:val="20"/>
               </w:rPr>
-              <w:t xml:space="preserve">Medium</w:t>
+              <w:t xml:space="preserve">49</w:t>
             </w:r>
           </w:p>
         </w:tc>
@@ -2093,7 +2504,7 @@
         </w:tc>
         <w:tc>
           <w:tcPr>
-            <w:tcW w:type="dxa" w:w="6300"/>
+            <w:tcW w:type="dxa" w:w="4700"/>
             <w:tcBorders>
               <w:top w:val="single" w:color="BFBFBF" w:sz="4"/>
               <w:left w:val="single" w:color="BFBFBF" w:sz="4"/>
@@ -2127,35 +2538,69 @@
         </w:tc>
         <w:tc>
           <w:tcPr>
-            <w:tcW w:type="dxa" w:w="1300"/>
-            <w:tcBorders>
-              <w:top w:val="single" w:color="BFBFBF" w:sz="4"/>
-              <w:left w:val="single" w:color="BFBFBF" w:sz="4"/>
-              <w:bottom w:val="single" w:color="BFBFBF" w:sz="4"/>
-              <w:right w:val="single" w:color="BFBFBF" w:sz="4"/>
-            </w:tcBorders>
-            <w:tcMar>
-              <w:top w:type="dxa" w:w="60"/>
-              <w:left w:type="dxa" w:w="100"/>
-              <w:bottom w:type="dxa" w:w="60"/>
-              <w:right w:type="dxa" w:w="100"/>
-            </w:tcMar>
-          </w:tcPr>
-          <w:p>
-            <w:pPr>
-              <w:keepNext w:val="false"/>
-              <w:keepLines/>
-              <w:spacing w:after="40"/>
-            </w:pPr>
-            <w:r>
-              <w:rPr>
-                <w:rFonts w:ascii="Calibri" w:cs="Calibri" w:eastAsia="Calibri" w:hAnsi="Calibri"/>
-                <w:b w:val="false"/>
-                <w:bCs w:val="false"/>
-                <w:sz w:val="20"/>
-                <w:szCs w:val="20"/>
-              </w:rPr>
-              <w:t xml:space="preserve">3.4</w:t>
+            <w:tcW w:type="dxa" w:w="1200"/>
+            <w:tcBorders>
+              <w:top w:val="single" w:color="BFBFBF" w:sz="4"/>
+              <w:left w:val="single" w:color="BFBFBF" w:sz="4"/>
+              <w:bottom w:val="single" w:color="BFBFBF" w:sz="4"/>
+              <w:right w:val="single" w:color="BFBFBF" w:sz="4"/>
+            </w:tcBorders>
+            <w:tcMar>
+              <w:top w:type="dxa" w:w="60"/>
+              <w:left w:type="dxa" w:w="100"/>
+              <w:bottom w:type="dxa" w:w="60"/>
+              <w:right w:type="dxa" w:w="100"/>
+            </w:tcMar>
+          </w:tcPr>
+          <w:p>
+            <w:pPr>
+              <w:keepNext w:val="false"/>
+              <w:keepLines/>
+              <w:spacing w:after="40"/>
+            </w:pPr>
+            <w:r>
+              <w:rPr>
+                <w:rFonts w:ascii="Calibri" w:cs="Calibri" w:eastAsia="Calibri" w:hAnsi="Calibri"/>
+                <w:b w:val="false"/>
+                <w:bCs w:val="false"/>
+                <w:sz w:val="20"/>
+                <w:szCs w:val="20"/>
+              </w:rPr>
+              <w:t xml:space="preserve">Low</w:t>
+            </w:r>
+          </w:p>
+        </w:tc>
+        <w:tc>
+          <w:tcPr>
+            <w:tcW w:type="dxa" w:w="1700"/>
+            <w:tcBorders>
+              <w:top w:val="single" w:color="BFBFBF" w:sz="4"/>
+              <w:left w:val="single" w:color="BFBFBF" w:sz="4"/>
+              <w:bottom w:val="single" w:color="BFBFBF" w:sz="4"/>
+              <w:right w:val="single" w:color="BFBFBF" w:sz="4"/>
+            </w:tcBorders>
+            <w:tcMar>
+              <w:top w:type="dxa" w:w="60"/>
+              <w:left w:type="dxa" w:w="100"/>
+              <w:bottom w:type="dxa" w:w="60"/>
+              <w:right w:type="dxa" w:w="100"/>
+            </w:tcMar>
+          </w:tcPr>
+          <w:p>
+            <w:pPr>
+              <w:keepNext w:val="false"/>
+              <w:keepLines/>
+              <w:spacing w:after="40"/>
+            </w:pPr>
+            <w:r>
+              <w:rPr>
+                <w:rFonts w:ascii="Calibri" w:cs="Calibri" w:eastAsia="Calibri" w:hAnsi="Calibri"/>
+                <w:b w:val="false"/>
+                <w:bCs w:val="false"/>
+                <w:sz w:val="20"/>
+                <w:szCs w:val="20"/>
+              </w:rPr>
+              <w:t xml:space="preserve">Accepted as suggested</w:t>
             </w:r>
           </w:p>
         </w:tc>
@@ -2189,7 +2634,7 @@
                 <w:sz w:val="20"/>
                 <w:szCs w:val="20"/>
               </w:rPr>
-              <w:t xml:space="preserve">Low</w:t>
+              <w:t xml:space="preserve">50</w:t>
             </w:r>
           </w:p>
         </w:tc>
@@ -2234,7 +2679,7 @@
         </w:tc>
         <w:tc>
           <w:tcPr>
-            <w:tcW w:type="dxa" w:w="6300"/>
+            <w:tcW w:type="dxa" w:w="4700"/>
             <w:tcBorders>
               <w:top w:val="single" w:color="BFBFBF" w:sz="4"/>
               <w:left w:val="single" w:color="BFBFBF" w:sz="4"/>
@@ -2268,35 +2713,69 @@
         </w:tc>
         <w:tc>
           <w:tcPr>
-            <w:tcW w:type="dxa" w:w="1300"/>
-            <w:tcBorders>
-              <w:top w:val="single" w:color="BFBFBF" w:sz="4"/>
-              <w:left w:val="single" w:color="BFBFBF" w:sz="4"/>
-              <w:bottom w:val="single" w:color="BFBFBF" w:sz="4"/>
-              <w:right w:val="single" w:color="BFBFBF" w:sz="4"/>
-            </w:tcBorders>
-            <w:tcMar>
-              <w:top w:type="dxa" w:w="60"/>
-              <w:left w:type="dxa" w:w="100"/>
-              <w:bottom w:type="dxa" w:w="60"/>
-              <w:right w:type="dxa" w:w="100"/>
-            </w:tcMar>
-          </w:tcPr>
-          <w:p>
-            <w:pPr>
-              <w:keepNext w:val="false"/>
-              <w:keepLines/>
-              <w:spacing w:after="40"/>
-            </w:pPr>
-            <w:r>
-              <w:rPr>
-                <w:rFonts w:ascii="Calibri" w:cs="Calibri" w:eastAsia="Calibri" w:hAnsi="Calibri"/>
-                <w:b w:val="false"/>
-                <w:bCs w:val="false"/>
-                <w:sz w:val="20"/>
-                <w:szCs w:val="20"/>
-              </w:rPr>
-              <w:t xml:space="preserve">6.5, 7.2, 19.1</w:t>
+            <w:tcW w:type="dxa" w:w="1200"/>
+            <w:tcBorders>
+              <w:top w:val="single" w:color="BFBFBF" w:sz="4"/>
+              <w:left w:val="single" w:color="BFBFBF" w:sz="4"/>
+              <w:bottom w:val="single" w:color="BFBFBF" w:sz="4"/>
+              <w:right w:val="single" w:color="BFBFBF" w:sz="4"/>
+            </w:tcBorders>
+            <w:tcMar>
+              <w:top w:type="dxa" w:w="60"/>
+              <w:left w:type="dxa" w:w="100"/>
+              <w:bottom w:type="dxa" w:w="60"/>
+              <w:right w:type="dxa" w:w="100"/>
+            </w:tcMar>
+          </w:tcPr>
+          <w:p>
+            <w:pPr>
+              <w:keepNext w:val="false"/>
+              <w:keepLines/>
+              <w:spacing w:after="40"/>
+            </w:pPr>
+            <w:r>
+              <w:rPr>
+                <w:rFonts w:ascii="Calibri" w:cs="Calibri" w:eastAsia="Calibri" w:hAnsi="Calibri"/>
+                <w:b w:val="false"/>
+                <w:bCs w:val="false"/>
+                <w:sz w:val="20"/>
+                <w:szCs w:val="20"/>
+              </w:rPr>
+              <w:t xml:space="preserve">Low</w:t>
+            </w:r>
+          </w:p>
+        </w:tc>
+        <w:tc>
+          <w:tcPr>
+            <w:tcW w:type="dxa" w:w="1700"/>
+            <w:tcBorders>
+              <w:top w:val="single" w:color="BFBFBF" w:sz="4"/>
+              <w:left w:val="single" w:color="BFBFBF" w:sz="4"/>
+              <w:bottom w:val="single" w:color="BFBFBF" w:sz="4"/>
+              <w:right w:val="single" w:color="BFBFBF" w:sz="4"/>
+            </w:tcBorders>
+            <w:tcMar>
+              <w:top w:type="dxa" w:w="60"/>
+              <w:left w:type="dxa" w:w="100"/>
+              <w:bottom w:type="dxa" w:w="60"/>
+              <w:right w:type="dxa" w:w="100"/>
+            </w:tcMar>
+          </w:tcPr>
+          <w:p>
+            <w:pPr>
+              <w:keepNext w:val="false"/>
+              <w:keepLines/>
+              <w:spacing w:after="40"/>
+            </w:pPr>
+            <w:r>
+              <w:rPr>
+                <w:rFonts w:ascii="Calibri" w:cs="Calibri" w:eastAsia="Calibri" w:hAnsi="Calibri"/>
+                <w:b w:val="false"/>
+                <w:bCs w:val="false"/>
+                <w:sz w:val="20"/>
+                <w:szCs w:val="20"/>
+              </w:rPr>
+              <w:t xml:space="preserve">Accepted as suggested</w:t>
             </w:r>
           </w:p>
         </w:tc>
@@ -2330,7 +2809,7 @@
                 <w:sz w:val="20"/>
                 <w:szCs w:val="20"/>
               </w:rPr>
-              <w:t xml:space="preserve">Low</w:t>
+              <w:t xml:space="preserve">51</w:t>
             </w:r>
           </w:p>
         </w:tc>
@@ -2375,7 +2854,7 @@
         </w:tc>
         <w:tc>
           <w:tcPr>
-            <w:tcW w:type="dxa" w:w="6300"/>
+            <w:tcW w:type="dxa" w:w="4700"/>
             <w:tcBorders>
               <w:top w:val="single" w:color="BFBFBF" w:sz="4"/>
               <w:left w:val="single" w:color="BFBFBF" w:sz="4"/>
@@ -2409,35 +2888,69 @@
         </w:tc>
         <w:tc>
           <w:tcPr>
-            <w:tcW w:type="dxa" w:w="1300"/>
-            <w:tcBorders>
-              <w:top w:val="single" w:color="BFBFBF" w:sz="4"/>
-              <w:left w:val="single" w:color="BFBFBF" w:sz="4"/>
-              <w:bottom w:val="single" w:color="BFBFBF" w:sz="4"/>
-              <w:right w:val="single" w:color="BFBFBF" w:sz="4"/>
-            </w:tcBorders>
-            <w:tcMar>
-              <w:top w:type="dxa" w:w="60"/>
-              <w:left w:type="dxa" w:w="100"/>
-              <w:bottom w:type="dxa" w:w="60"/>
-              <w:right w:type="dxa" w:w="100"/>
-            </w:tcMar>
-          </w:tcPr>
-          <w:p>
-            <w:pPr>
-              <w:keepNext w:val="false"/>
-              <w:keepLines/>
-              <w:spacing w:after="40"/>
-            </w:pPr>
-            <w:r>
-              <w:rPr>
-                <w:rFonts w:ascii="Calibri" w:cs="Calibri" w:eastAsia="Calibri" w:hAnsi="Calibri"/>
-                <w:b w:val="false"/>
-                <w:bCs w:val="false"/>
-                <w:sz w:val="20"/>
-                <w:szCs w:val="20"/>
-              </w:rPr>
-              <w:t xml:space="preserve">15.3</w:t>
+            <w:tcW w:type="dxa" w:w="1200"/>
+            <w:tcBorders>
+              <w:top w:val="single" w:color="BFBFBF" w:sz="4"/>
+              <w:left w:val="single" w:color="BFBFBF" w:sz="4"/>
+              <w:bottom w:val="single" w:color="BFBFBF" w:sz="4"/>
+              <w:right w:val="single" w:color="BFBFBF" w:sz="4"/>
+            </w:tcBorders>
+            <w:tcMar>
+              <w:top w:type="dxa" w:w="60"/>
+              <w:left w:type="dxa" w:w="100"/>
+              <w:bottom w:type="dxa" w:w="60"/>
+              <w:right w:type="dxa" w:w="100"/>
+            </w:tcMar>
+          </w:tcPr>
+          <w:p>
+            <w:pPr>
+              <w:keepNext w:val="false"/>
+              <w:keepLines/>
+              <w:spacing w:after="40"/>
+            </w:pPr>
+            <w:r>
+              <w:rPr>
+                <w:rFonts w:ascii="Calibri" w:cs="Calibri" w:eastAsia="Calibri" w:hAnsi="Calibri"/>
+                <w:b w:val="false"/>
+                <w:bCs w:val="false"/>
+                <w:sz w:val="20"/>
+                <w:szCs w:val="20"/>
+              </w:rPr>
+              <w:t xml:space="preserve">Medium</w:t>
+            </w:r>
+          </w:p>
+        </w:tc>
+        <w:tc>
+          <w:tcPr>
+            <w:tcW w:type="dxa" w:w="1700"/>
+            <w:tcBorders>
+              <w:top w:val="single" w:color="BFBFBF" w:sz="4"/>
+              <w:left w:val="single" w:color="BFBFBF" w:sz="4"/>
+              <w:bottom w:val="single" w:color="BFBFBF" w:sz="4"/>
+              <w:right w:val="single" w:color="BFBFBF" w:sz="4"/>
+            </w:tcBorders>
+            <w:tcMar>
+              <w:top w:type="dxa" w:w="60"/>
+              <w:left w:type="dxa" w:w="100"/>
+              <w:bottom w:type="dxa" w:w="60"/>
+              <w:right w:type="dxa" w:w="100"/>
+            </w:tcMar>
+          </w:tcPr>
+          <w:p>
+            <w:pPr>
+              <w:keepNext w:val="false"/>
+              <w:keepLines/>
+              <w:spacing w:after="40"/>
+            </w:pPr>
+            <w:r>
+              <w:rPr>
+                <w:rFonts w:ascii="Calibri" w:cs="Calibri" w:eastAsia="Calibri" w:hAnsi="Calibri"/>
+                <w:b w:val="false"/>
+                <w:bCs w:val="false"/>
+                <w:sz w:val="20"/>
+                <w:szCs w:val="20"/>
+              </w:rPr>
+              <w:t xml:space="preserve">Accepted as suggested</w:t>
             </w:r>
           </w:p>
         </w:tc>
@@ -2471,7 +2984,7 @@
                 <w:sz w:val="20"/>
                 <w:szCs w:val="20"/>
               </w:rPr>
-              <w:t xml:space="preserve">Medium</w:t>
+              <w:t xml:space="preserve">52</w:t>
             </w:r>
           </w:p>
         </w:tc>
@@ -2516,7 +3029,7 @@
         </w:tc>
         <w:tc>
           <w:tcPr>
-            <w:tcW w:type="dxa" w:w="6300"/>
+            <w:tcW w:type="dxa" w:w="4700"/>
             <w:tcBorders>
               <w:top w:val="single" w:color="BFBFBF" w:sz="4"/>
               <w:left w:val="single" w:color="BFBFBF" w:sz="4"/>
@@ -2550,35 +3063,69 @@
         </w:tc>
         <w:tc>
           <w:tcPr>
-            <w:tcW w:type="dxa" w:w="1300"/>
-            <w:tcBorders>
-              <w:top w:val="single" w:color="BFBFBF" w:sz="4"/>
-              <w:left w:val="single" w:color="BFBFBF" w:sz="4"/>
-              <w:bottom w:val="single" w:color="BFBFBF" w:sz="4"/>
-              <w:right w:val="single" w:color="BFBFBF" w:sz="4"/>
-            </w:tcBorders>
-            <w:tcMar>
-              <w:top w:type="dxa" w:w="60"/>
-              <w:left w:type="dxa" w:w="100"/>
-              <w:bottom w:type="dxa" w:w="60"/>
-              <w:right w:type="dxa" w:w="100"/>
-            </w:tcMar>
-          </w:tcPr>
-          <w:p>
-            <w:pPr>
-              <w:keepNext w:val="false"/>
-              <w:keepLines/>
-              <w:spacing w:after="40"/>
-            </w:pPr>
-            <w:r>
-              <w:rPr>
-                <w:rFonts w:ascii="Calibri" w:cs="Calibri" w:eastAsia="Calibri" w:hAnsi="Calibri"/>
-                <w:b w:val="false"/>
-                <w:bCs w:val="false"/>
-                <w:sz w:val="20"/>
-                <w:szCs w:val="20"/>
-              </w:rPr>
-              <w:t xml:space="preserve">17.3</w:t>
+            <w:tcW w:type="dxa" w:w="1200"/>
+            <w:tcBorders>
+              <w:top w:val="single" w:color="BFBFBF" w:sz="4"/>
+              <w:left w:val="single" w:color="BFBFBF" w:sz="4"/>
+              <w:bottom w:val="single" w:color="BFBFBF" w:sz="4"/>
+              <w:right w:val="single" w:color="BFBFBF" w:sz="4"/>
+            </w:tcBorders>
+            <w:tcMar>
+              <w:top w:type="dxa" w:w="60"/>
+              <w:left w:type="dxa" w:w="100"/>
+              <w:bottom w:type="dxa" w:w="60"/>
+              <w:right w:type="dxa" w:w="100"/>
+            </w:tcMar>
+          </w:tcPr>
+          <w:p>
+            <w:pPr>
+              <w:keepNext w:val="false"/>
+              <w:keepLines/>
+              <w:spacing w:after="40"/>
+            </w:pPr>
+            <w:r>
+              <w:rPr>
+                <w:rFonts w:ascii="Calibri" w:cs="Calibri" w:eastAsia="Calibri" w:hAnsi="Calibri"/>
+                <w:b w:val="false"/>
+                <w:bCs w:val="false"/>
+                <w:sz w:val="20"/>
+                <w:szCs w:val="20"/>
+              </w:rPr>
+              <w:t xml:space="preserve">Low</w:t>
+            </w:r>
+          </w:p>
+        </w:tc>
+        <w:tc>
+          <w:tcPr>
+            <w:tcW w:type="dxa" w:w="1700"/>
+            <w:tcBorders>
+              <w:top w:val="single" w:color="BFBFBF" w:sz="4"/>
+              <w:left w:val="single" w:color="BFBFBF" w:sz="4"/>
+              <w:bottom w:val="single" w:color="BFBFBF" w:sz="4"/>
+              <w:right w:val="single" w:color="BFBFBF" w:sz="4"/>
+            </w:tcBorders>
+            <w:tcMar>
+              <w:top w:type="dxa" w:w="60"/>
+              <w:left w:type="dxa" w:w="100"/>
+              <w:bottom w:type="dxa" w:w="60"/>
+              <w:right w:type="dxa" w:w="100"/>
+            </w:tcMar>
+          </w:tcPr>
+          <w:p>
+            <w:pPr>
+              <w:keepNext w:val="false"/>
+              <w:keepLines/>
+              <w:spacing w:after="40"/>
+            </w:pPr>
+            <w:r>
+              <w:rPr>
+                <w:rFonts w:ascii="Calibri" w:cs="Calibri" w:eastAsia="Calibri" w:hAnsi="Calibri"/>
+                <w:b w:val="false"/>
+                <w:bCs w:val="false"/>
+                <w:sz w:val="20"/>
+                <w:szCs w:val="20"/>
+              </w:rPr>
+              <w:t xml:space="preserve">Accepted as suggested</w:t>
             </w:r>
           </w:p>
         </w:tc>
@@ -2612,7 +3159,7 @@
                 <w:sz w:val="20"/>
                 <w:szCs w:val="20"/>
               </w:rPr>
-              <w:t xml:space="preserve">Low</w:t>
+              <w:t xml:space="preserve">53</w:t>
             </w:r>
           </w:p>
         </w:tc>
@@ -2657,7 +3204,7 @@
         </w:tc>
         <w:tc>
           <w:tcPr>
-            <w:tcW w:type="dxa" w:w="6300"/>
+            <w:tcW w:type="dxa" w:w="4700"/>
             <w:tcBorders>
               <w:top w:val="single" w:color="BFBFBF" w:sz="4"/>
               <w:left w:val="single" w:color="BFBFBF" w:sz="4"/>
@@ -2691,35 +3238,69 @@
         </w:tc>
         <w:tc>
           <w:tcPr>
-            <w:tcW w:type="dxa" w:w="1300"/>
-            <w:tcBorders>
-              <w:top w:val="single" w:color="BFBFBF" w:sz="4"/>
-              <w:left w:val="single" w:color="BFBFBF" w:sz="4"/>
-              <w:bottom w:val="single" w:color="BFBFBF" w:sz="4"/>
-              <w:right w:val="single" w:color="BFBFBF" w:sz="4"/>
-            </w:tcBorders>
-            <w:tcMar>
-              <w:top w:type="dxa" w:w="60"/>
-              <w:left w:type="dxa" w:w="100"/>
-              <w:bottom w:type="dxa" w:w="60"/>
-              <w:right w:type="dxa" w:w="100"/>
-            </w:tcMar>
-          </w:tcPr>
-          <w:p>
-            <w:pPr>
-              <w:keepNext w:val="false"/>
-              <w:keepLines/>
-              <w:spacing w:after="40"/>
-            </w:pPr>
-            <w:r>
-              <w:rPr>
-                <w:rFonts w:ascii="Calibri" w:cs="Calibri" w:eastAsia="Calibri" w:hAnsi="Calibri"/>
-                <w:b w:val="false"/>
-                <w:bCs w:val="false"/>
-                <w:sz w:val="20"/>
-                <w:szCs w:val="20"/>
-              </w:rPr>
-              <w:t xml:space="preserve">16.2</w:t>
+            <w:tcW w:type="dxa" w:w="1200"/>
+            <w:tcBorders>
+              <w:top w:val="single" w:color="BFBFBF" w:sz="4"/>
+              <w:left w:val="single" w:color="BFBFBF" w:sz="4"/>
+              <w:bottom w:val="single" w:color="BFBFBF" w:sz="4"/>
+              <w:right w:val="single" w:color="BFBFBF" w:sz="4"/>
+            </w:tcBorders>
+            <w:tcMar>
+              <w:top w:type="dxa" w:w="60"/>
+              <w:left w:type="dxa" w:w="100"/>
+              <w:bottom w:type="dxa" w:w="60"/>
+              <w:right w:type="dxa" w:w="100"/>
+            </w:tcMar>
+          </w:tcPr>
+          <w:p>
+            <w:pPr>
+              <w:keepNext w:val="false"/>
+              <w:keepLines/>
+              <w:spacing w:after="40"/>
+            </w:pPr>
+            <w:r>
+              <w:rPr>
+                <w:rFonts w:ascii="Calibri" w:cs="Calibri" w:eastAsia="Calibri" w:hAnsi="Calibri"/>
+                <w:b w:val="false"/>
+                <w:bCs w:val="false"/>
+                <w:sz w:val="20"/>
+                <w:szCs w:val="20"/>
+              </w:rPr>
+              <w:t xml:space="preserve">Low</w:t>
+            </w:r>
+          </w:p>
+        </w:tc>
+        <w:tc>
+          <w:tcPr>
+            <w:tcW w:type="dxa" w:w="1700"/>
+            <w:tcBorders>
+              <w:top w:val="single" w:color="BFBFBF" w:sz="4"/>
+              <w:left w:val="single" w:color="BFBFBF" w:sz="4"/>
+              <w:bottom w:val="single" w:color="BFBFBF" w:sz="4"/>
+              <w:right w:val="single" w:color="BFBFBF" w:sz="4"/>
+            </w:tcBorders>
+            <w:tcMar>
+              <w:top w:type="dxa" w:w="60"/>
+              <w:left w:type="dxa" w:w="100"/>
+              <w:bottom w:type="dxa" w:w="60"/>
+              <w:right w:type="dxa" w:w="100"/>
+            </w:tcMar>
+          </w:tcPr>
+          <w:p>
+            <w:pPr>
+              <w:keepNext w:val="false"/>
+              <w:keepLines/>
+              <w:spacing w:after="40"/>
+            </w:pPr>
+            <w:r>
+              <w:rPr>
+                <w:rFonts w:ascii="Calibri" w:cs="Calibri" w:eastAsia="Calibri" w:hAnsi="Calibri"/>
+                <w:b w:val="false"/>
+                <w:bCs w:val="false"/>
+                <w:sz w:val="20"/>
+                <w:szCs w:val="20"/>
+              </w:rPr>
+              <w:t xml:space="preserve">Accepted as suggested</w:t>
             </w:r>
           </w:p>
         </w:tc>
@@ -2753,7 +3334,7 @@
                 <w:sz w:val="20"/>
                 <w:szCs w:val="20"/>
               </w:rPr>
-              <w:t xml:space="preserve">Low</w:t>
+              <w:t xml:space="preserve">54</w:t>
             </w:r>
           </w:p>
         </w:tc>
@@ -2798,7 +3379,7 @@
         </w:tc>
         <w:tc>
           <w:tcPr>
-            <w:tcW w:type="dxa" w:w="6300"/>
+            <w:tcW w:type="dxa" w:w="4700"/>
             <w:tcBorders>
               <w:top w:val="single" w:color="BFBFBF" w:sz="4"/>
               <w:left w:val="single" w:color="BFBFBF" w:sz="4"/>
@@ -2832,35 +3413,69 @@
         </w:tc>
         <w:tc>
           <w:tcPr>
-            <w:tcW w:type="dxa" w:w="1300"/>
-            <w:tcBorders>
-              <w:top w:val="single" w:color="BFBFBF" w:sz="4"/>
-              <w:left w:val="single" w:color="BFBFBF" w:sz="4"/>
-              <w:bottom w:val="single" w:color="BFBFBF" w:sz="4"/>
-              <w:right w:val="single" w:color="BFBFBF" w:sz="4"/>
-            </w:tcBorders>
-            <w:tcMar>
-              <w:top w:type="dxa" w:w="60"/>
-              <w:left w:type="dxa" w:w="100"/>
-              <w:bottom w:type="dxa" w:w="60"/>
-              <w:right w:type="dxa" w:w="100"/>
-            </w:tcMar>
-          </w:tcPr>
-          <w:p>
-            <w:pPr>
-              <w:keepNext w:val="false"/>
-              <w:keepLines/>
-              <w:spacing w:after="40"/>
-            </w:pPr>
-            <w:r>
-              <w:rPr>
-                <w:rFonts w:ascii="Calibri" w:cs="Calibri" w:eastAsia="Calibri" w:hAnsi="Calibri"/>
-                <w:b w:val="false"/>
-                <w:bCs w:val="false"/>
-                <w:sz w:val="20"/>
-                <w:szCs w:val="20"/>
-              </w:rPr>
-              <w:t xml:space="preserve">16.1</w:t>
+            <w:tcW w:type="dxa" w:w="1200"/>
+            <w:tcBorders>
+              <w:top w:val="single" w:color="BFBFBF" w:sz="4"/>
+              <w:left w:val="single" w:color="BFBFBF" w:sz="4"/>
+              <w:bottom w:val="single" w:color="BFBFBF" w:sz="4"/>
+              <w:right w:val="single" w:color="BFBFBF" w:sz="4"/>
+            </w:tcBorders>
+            <w:tcMar>
+              <w:top w:type="dxa" w:w="60"/>
+              <w:left w:type="dxa" w:w="100"/>
+              <w:bottom w:type="dxa" w:w="60"/>
+              <w:right w:type="dxa" w:w="100"/>
+            </w:tcMar>
+          </w:tcPr>
+          <w:p>
+            <w:pPr>
+              <w:keepNext w:val="false"/>
+              <w:keepLines/>
+              <w:spacing w:after="40"/>
+            </w:pPr>
+            <w:r>
+              <w:rPr>
+                <w:rFonts w:ascii="Calibri" w:cs="Calibri" w:eastAsia="Calibri" w:hAnsi="Calibri"/>
+                <w:b w:val="false"/>
+                <w:bCs w:val="false"/>
+                <w:sz w:val="20"/>
+                <w:szCs w:val="20"/>
+              </w:rPr>
+              <w:t xml:space="preserve">Medium for data retention; Low for the rest</w:t>
+            </w:r>
+          </w:p>
+        </w:tc>
+        <w:tc>
+          <w:tcPr>
+            <w:tcW w:type="dxa" w:w="1700"/>
+            <w:tcBorders>
+              <w:top w:val="single" w:color="BFBFBF" w:sz="4"/>
+              <w:left w:val="single" w:color="BFBFBF" w:sz="4"/>
+              <w:bottom w:val="single" w:color="BFBFBF" w:sz="4"/>
+              <w:right w:val="single" w:color="BFBFBF" w:sz="4"/>
+            </w:tcBorders>
+            <w:tcMar>
+              <w:top w:type="dxa" w:w="60"/>
+              <w:left w:type="dxa" w:w="100"/>
+              <w:bottom w:type="dxa" w:w="60"/>
+              <w:right w:type="dxa" w:w="100"/>
+            </w:tcMar>
+          </w:tcPr>
+          <w:p>
+            <w:pPr>
+              <w:keepNext w:val="false"/>
+              <w:keepLines/>
+              <w:spacing w:after="40"/>
+            </w:pPr>
+            <w:r>
+              <w:rPr>
+                <w:rFonts w:ascii="Calibri" w:cs="Calibri" w:eastAsia="Calibri" w:hAnsi="Calibri"/>
+                <w:b w:val="false"/>
+                <w:bCs w:val="false"/>
+                <w:sz w:val="20"/>
+                <w:szCs w:val="20"/>
+              </w:rPr>
+              <w:t xml:space="preserve">Accepted, with these specifics</w:t>
             </w:r>
           </w:p>
         </w:tc>
@@ -2894,7 +3509,7 @@
                 <w:sz w:val="20"/>
                 <w:szCs w:val="20"/>
               </w:rPr>
-              <w:t xml:space="preserve">Medium for data retention; Low for the rest</w:t>
+              <w:t xml:space="preserve">55</w:t>
             </w:r>
           </w:p>
         </w:tc>
@@ -2939,7 +3554,7 @@
         </w:tc>
         <w:tc>
           <w:tcPr>
-            <w:tcW w:type="dxa" w:w="6300"/>
+            <w:tcW w:type="dxa" w:w="4700"/>
             <w:tcBorders>
               <w:top w:val="single" w:color="BFBFBF" w:sz="4"/>
               <w:left w:val="single" w:color="BFBFBF" w:sz="4"/>
@@ -2973,35 +3588,69 @@
         </w:tc>
         <w:tc>
           <w:tcPr>
-            <w:tcW w:type="dxa" w:w="1300"/>
-            <w:tcBorders>
-              <w:top w:val="single" w:color="BFBFBF" w:sz="4"/>
-              <w:left w:val="single" w:color="BFBFBF" w:sz="4"/>
-              <w:bottom w:val="single" w:color="BFBFBF" w:sz="4"/>
-              <w:right w:val="single" w:color="BFBFBF" w:sz="4"/>
-            </w:tcBorders>
-            <w:tcMar>
-              <w:top w:type="dxa" w:w="60"/>
-              <w:left w:type="dxa" w:w="100"/>
-              <w:bottom w:type="dxa" w:w="60"/>
-              <w:right w:type="dxa" w:w="100"/>
-            </w:tcMar>
-          </w:tcPr>
-          <w:p>
-            <w:pPr>
-              <w:keepNext w:val="false"/>
-              <w:keepLines/>
-              <w:spacing w:after="40"/>
-            </w:pPr>
-            <w:r>
-              <w:rPr>
-                <w:rFonts w:ascii="Calibri" w:cs="Calibri" w:eastAsia="Calibri" w:hAnsi="Calibri"/>
-                <w:b w:val="false"/>
-                <w:bCs w:val="false"/>
-                <w:sz w:val="20"/>
-                <w:szCs w:val="20"/>
-              </w:rPr>
-              <w:t xml:space="preserve">5.2, 5.3</w:t>
+            <w:tcW w:type="dxa" w:w="1200"/>
+            <w:tcBorders>
+              <w:top w:val="single" w:color="BFBFBF" w:sz="4"/>
+              <w:left w:val="single" w:color="BFBFBF" w:sz="4"/>
+              <w:bottom w:val="single" w:color="BFBFBF" w:sz="4"/>
+              <w:right w:val="single" w:color="BFBFBF" w:sz="4"/>
+            </w:tcBorders>
+            <w:tcMar>
+              <w:top w:type="dxa" w:w="60"/>
+              <w:left w:type="dxa" w:w="100"/>
+              <w:bottom w:type="dxa" w:w="60"/>
+              <w:right w:type="dxa" w:w="100"/>
+            </w:tcMar>
+          </w:tcPr>
+          <w:p>
+            <w:pPr>
+              <w:keepNext w:val="false"/>
+              <w:keepLines/>
+              <w:spacing w:after="40"/>
+            </w:pPr>
+            <w:r>
+              <w:rPr>
+                <w:rFonts w:ascii="Calibri" w:cs="Calibri" w:eastAsia="Calibri" w:hAnsi="Calibri"/>
+                <w:b w:val="false"/>
+                <w:bCs w:val="false"/>
+                <w:sz w:val="20"/>
+                <w:szCs w:val="20"/>
+              </w:rPr>
+              <w:t xml:space="preserve">Low</w:t>
+            </w:r>
+          </w:p>
+        </w:tc>
+        <w:tc>
+          <w:tcPr>
+            <w:tcW w:type="dxa" w:w="1700"/>
+            <w:tcBorders>
+              <w:top w:val="single" w:color="BFBFBF" w:sz="4"/>
+              <w:left w:val="single" w:color="BFBFBF" w:sz="4"/>
+              <w:bottom w:val="single" w:color="BFBFBF" w:sz="4"/>
+              <w:right w:val="single" w:color="BFBFBF" w:sz="4"/>
+            </w:tcBorders>
+            <w:tcMar>
+              <w:top w:type="dxa" w:w="60"/>
+              <w:left w:type="dxa" w:w="100"/>
+              <w:bottom w:type="dxa" w:w="60"/>
+              <w:right w:type="dxa" w:w="100"/>
+            </w:tcMar>
+          </w:tcPr>
+          <w:p>
+            <w:pPr>
+              <w:keepNext w:val="false"/>
+              <w:keepLines/>
+              <w:spacing w:after="40"/>
+            </w:pPr>
+            <w:r>
+              <w:rPr>
+                <w:rFonts w:ascii="Calibri" w:cs="Calibri" w:eastAsia="Calibri" w:hAnsi="Calibri"/>
+                <w:b w:val="false"/>
+                <w:bCs w:val="false"/>
+                <w:sz w:val="20"/>
+                <w:szCs w:val="20"/>
+              </w:rPr>
+              <w:t xml:space="preserve">Accepted as suggested</w:t>
             </w:r>
           </w:p>
         </w:tc>
@@ -3035,7 +3684,7 @@
                 <w:sz w:val="20"/>
                 <w:szCs w:val="20"/>
               </w:rPr>
-              <w:t xml:space="preserve">Low</w:t>
+              <w:t xml:space="preserve">56</w:t>
             </w:r>
           </w:p>
         </w:tc>
@@ -3080,7 +3729,7 @@
         </w:tc>
         <w:tc>
           <w:tcPr>
-            <w:tcW w:type="dxa" w:w="6300"/>
+            <w:tcW w:type="dxa" w:w="4700"/>
             <w:tcBorders>
               <w:top w:val="single" w:color="BFBFBF" w:sz="4"/>
               <w:left w:val="single" w:color="BFBFBF" w:sz="4"/>
@@ -3114,35 +3763,69 @@
         </w:tc>
         <w:tc>
           <w:tcPr>
-            <w:tcW w:type="dxa" w:w="1300"/>
-            <w:tcBorders>
-              <w:top w:val="single" w:color="BFBFBF" w:sz="4"/>
-              <w:left w:val="single" w:color="BFBFBF" w:sz="4"/>
-              <w:bottom w:val="single" w:color="BFBFBF" w:sz="4"/>
-              <w:right w:val="single" w:color="BFBFBF" w:sz="4"/>
-            </w:tcBorders>
-            <w:tcMar>
-              <w:top w:type="dxa" w:w="60"/>
-              <w:left w:type="dxa" w:w="100"/>
-              <w:bottom w:type="dxa" w:w="60"/>
-              <w:right w:type="dxa" w:w="100"/>
-            </w:tcMar>
-          </w:tcPr>
-          <w:p>
-            <w:pPr>
-              <w:keepNext w:val="false"/>
-              <w:keepLines/>
-              <w:spacing w:after="40"/>
-            </w:pPr>
-            <w:r>
-              <w:rPr>
-                <w:rFonts w:ascii="Calibri" w:cs="Calibri" w:eastAsia="Calibri" w:hAnsi="Calibri"/>
-                <w:b w:val="false"/>
-                <w:bCs w:val="false"/>
-                <w:sz w:val="20"/>
-                <w:szCs w:val="20"/>
-              </w:rPr>
-              <w:t xml:space="preserve">5.4, 7.3</w:t>
+            <w:tcW w:type="dxa" w:w="1200"/>
+            <w:tcBorders>
+              <w:top w:val="single" w:color="BFBFBF" w:sz="4"/>
+              <w:left w:val="single" w:color="BFBFBF" w:sz="4"/>
+              <w:bottom w:val="single" w:color="BFBFBF" w:sz="4"/>
+              <w:right w:val="single" w:color="BFBFBF" w:sz="4"/>
+            </w:tcBorders>
+            <w:tcMar>
+              <w:top w:type="dxa" w:w="60"/>
+              <w:left w:type="dxa" w:w="100"/>
+              <w:bottom w:type="dxa" w:w="60"/>
+              <w:right w:type="dxa" w:w="100"/>
+            </w:tcMar>
+          </w:tcPr>
+          <w:p>
+            <w:pPr>
+              <w:keepNext w:val="false"/>
+              <w:keepLines/>
+              <w:spacing w:after="40"/>
+            </w:pPr>
+            <w:r>
+              <w:rPr>
+                <w:rFonts w:ascii="Calibri" w:cs="Calibri" w:eastAsia="Calibri" w:hAnsi="Calibri"/>
+                <w:b w:val="false"/>
+                <w:bCs w:val="false"/>
+                <w:sz w:val="20"/>
+                <w:szCs w:val="20"/>
+              </w:rPr>
+              <w:t xml:space="preserve">Medium for planning</w:t>
+            </w:r>
+          </w:p>
+        </w:tc>
+        <w:tc>
+          <w:tcPr>
+            <w:tcW w:type="dxa" w:w="1700"/>
+            <w:tcBorders>
+              <w:top w:val="single" w:color="BFBFBF" w:sz="4"/>
+              <w:left w:val="single" w:color="BFBFBF" w:sz="4"/>
+              <w:bottom w:val="single" w:color="BFBFBF" w:sz="4"/>
+              <w:right w:val="single" w:color="BFBFBF" w:sz="4"/>
+            </w:tcBorders>
+            <w:tcMar>
+              <w:top w:type="dxa" w:w="60"/>
+              <w:left w:type="dxa" w:w="100"/>
+              <w:bottom w:type="dxa" w:w="60"/>
+              <w:right w:type="dxa" w:w="100"/>
+            </w:tcMar>
+          </w:tcPr>
+          <w:p>
+            <w:pPr>
+              <w:keepNext w:val="false"/>
+              <w:keepLines/>
+              <w:spacing w:after="40"/>
+            </w:pPr>
+            <w:r>
+              <w:rPr>
+                <w:rFonts w:ascii="Calibri" w:cs="Calibri" w:eastAsia="Calibri" w:hAnsi="Calibri"/>
+                <w:b w:val="false"/>
+                <w:bCs w:val="false"/>
+                <w:sz w:val="20"/>
+                <w:szCs w:val="20"/>
+              </w:rPr>
+              <w:t xml:space="preserve">Accepted, with these specifics</w:t>
             </w:r>
           </w:p>
         </w:tc>
@@ -3176,7 +3859,7 @@
                 <w:sz w:val="20"/>
                 <w:szCs w:val="20"/>
               </w:rPr>
-              <w:t xml:space="preserve">Medium for planning</w:t>
+              <w:t xml:space="preserve">57</w:t>
             </w:r>
           </w:p>
         </w:tc>
@@ -3221,7 +3904,7 @@
         </w:tc>
         <w:tc>
           <w:tcPr>
-            <w:tcW w:type="dxa" w:w="6300"/>
+            <w:tcW w:type="dxa" w:w="4700"/>
             <w:tcBorders>
               <w:top w:val="single" w:color="BFBFBF" w:sz="4"/>
               <w:left w:val="single" w:color="BFBFBF" w:sz="4"/>
@@ -3255,35 +3938,69 @@
         </w:tc>
         <w:tc>
           <w:tcPr>
-            <w:tcW w:type="dxa" w:w="1300"/>
-            <w:tcBorders>
-              <w:top w:val="single" w:color="BFBFBF" w:sz="4"/>
-              <w:left w:val="single" w:color="BFBFBF" w:sz="4"/>
-              <w:bottom w:val="single" w:color="BFBFBF" w:sz="4"/>
-              <w:right w:val="single" w:color="BFBFBF" w:sz="4"/>
-            </w:tcBorders>
-            <w:tcMar>
-              <w:top w:type="dxa" w:w="60"/>
-              <w:left w:type="dxa" w:w="100"/>
-              <w:bottom w:type="dxa" w:w="60"/>
-              <w:right w:type="dxa" w:w="100"/>
-            </w:tcMar>
-          </w:tcPr>
-          <w:p>
-            <w:pPr>
-              <w:keepNext w:val="false"/>
-              <w:keepLines/>
-              <w:spacing w:after="40"/>
-            </w:pPr>
-            <w:r>
-              <w:rPr>
-                <w:rFonts w:ascii="Calibri" w:cs="Calibri" w:eastAsia="Calibri" w:hAnsi="Calibri"/>
-                <w:b w:val="false"/>
-                <w:bCs w:val="false"/>
-                <w:sz w:val="20"/>
-                <w:szCs w:val="20"/>
-              </w:rPr>
-              <w:t xml:space="preserve">6.3</w:t>
+            <w:tcW w:type="dxa" w:w="1200"/>
+            <w:tcBorders>
+              <w:top w:val="single" w:color="BFBFBF" w:sz="4"/>
+              <w:left w:val="single" w:color="BFBFBF" w:sz="4"/>
+              <w:bottom w:val="single" w:color="BFBFBF" w:sz="4"/>
+              <w:right w:val="single" w:color="BFBFBF" w:sz="4"/>
+            </w:tcBorders>
+            <w:tcMar>
+              <w:top w:type="dxa" w:w="60"/>
+              <w:left w:type="dxa" w:w="100"/>
+              <w:bottom w:type="dxa" w:w="60"/>
+              <w:right w:type="dxa" w:w="100"/>
+            </w:tcMar>
+          </w:tcPr>
+          <w:p>
+            <w:pPr>
+              <w:keepNext w:val="false"/>
+              <w:keepLines/>
+              <w:spacing w:after="40"/>
+            </w:pPr>
+            <w:r>
+              <w:rPr>
+                <w:rFonts w:ascii="Calibri" w:cs="Calibri" w:eastAsia="Calibri" w:hAnsi="Calibri"/>
+                <w:b w:val="false"/>
+                <w:bCs w:val="false"/>
+                <w:sz w:val="20"/>
+                <w:szCs w:val="20"/>
+              </w:rPr>
+              <w:t xml:space="preserve">Medium</w:t>
+            </w:r>
+          </w:p>
+        </w:tc>
+        <w:tc>
+          <w:tcPr>
+            <w:tcW w:type="dxa" w:w="1700"/>
+            <w:tcBorders>
+              <w:top w:val="single" w:color="BFBFBF" w:sz="4"/>
+              <w:left w:val="single" w:color="BFBFBF" w:sz="4"/>
+              <w:bottom w:val="single" w:color="BFBFBF" w:sz="4"/>
+              <w:right w:val="single" w:color="BFBFBF" w:sz="4"/>
+            </w:tcBorders>
+            <w:tcMar>
+              <w:top w:type="dxa" w:w="60"/>
+              <w:left w:type="dxa" w:w="100"/>
+              <w:bottom w:type="dxa" w:w="60"/>
+              <w:right w:type="dxa" w:w="100"/>
+            </w:tcMar>
+          </w:tcPr>
+          <w:p>
+            <w:pPr>
+              <w:keepNext w:val="false"/>
+              <w:keepLines/>
+              <w:spacing w:after="40"/>
+            </w:pPr>
+            <w:r>
+              <w:rPr>
+                <w:rFonts w:ascii="Calibri" w:cs="Calibri" w:eastAsia="Calibri" w:hAnsi="Calibri"/>
+                <w:b w:val="false"/>
+                <w:bCs w:val="false"/>
+                <w:sz w:val="20"/>
+                <w:szCs w:val="20"/>
+              </w:rPr>
+              <w:t xml:space="preserve">Accepted as suggested</w:t>
             </w:r>
           </w:p>
         </w:tc>
@@ -3317,7 +4034,7 @@
                 <w:sz w:val="20"/>
                 <w:szCs w:val="20"/>
               </w:rPr>
-              <w:t xml:space="preserve">Medium</w:t>
+              <w:t xml:space="preserve">58</w:t>
             </w:r>
           </w:p>
         </w:tc>
@@ -3362,7 +4079,7 @@
         </w:tc>
         <w:tc>
           <w:tcPr>
-            <w:tcW w:type="dxa" w:w="6300"/>
+            <w:tcW w:type="dxa" w:w="4700"/>
             <w:tcBorders>
               <w:top w:val="single" w:color="BFBFBF" w:sz="4"/>
               <w:left w:val="single" w:color="BFBFBF" w:sz="4"/>
@@ -3396,35 +4113,69 @@
         </w:tc>
         <w:tc>
           <w:tcPr>
-            <w:tcW w:type="dxa" w:w="1300"/>
-            <w:tcBorders>
-              <w:top w:val="single" w:color="BFBFBF" w:sz="4"/>
-              <w:left w:val="single" w:color="BFBFBF" w:sz="4"/>
-              <w:bottom w:val="single" w:color="BFBFBF" w:sz="4"/>
-              <w:right w:val="single" w:color="BFBFBF" w:sz="4"/>
-            </w:tcBorders>
-            <w:tcMar>
-              <w:top w:type="dxa" w:w="60"/>
-              <w:left w:type="dxa" w:w="100"/>
-              <w:bottom w:type="dxa" w:w="60"/>
-              <w:right w:type="dxa" w:w="100"/>
-            </w:tcMar>
-          </w:tcPr>
-          <w:p>
-            <w:pPr>
-              <w:keepNext w:val="false"/>
-              <w:keepLines/>
-              <w:spacing w:after="40"/>
-            </w:pPr>
-            <w:r>
-              <w:rPr>
-                <w:rFonts w:ascii="Calibri" w:cs="Calibri" w:eastAsia="Calibri" w:hAnsi="Calibri"/>
-                <w:b w:val="false"/>
-                <w:bCs w:val="false"/>
-                <w:sz w:val="20"/>
-                <w:szCs w:val="20"/>
-              </w:rPr>
-              <w:t xml:space="preserve">Tech. Arch. 8, 9.1; 15.2</w:t>
+            <w:tcW w:type="dxa" w:w="1200"/>
+            <w:tcBorders>
+              <w:top w:val="single" w:color="BFBFBF" w:sz="4"/>
+              <w:left w:val="single" w:color="BFBFBF" w:sz="4"/>
+              <w:bottom w:val="single" w:color="BFBFBF" w:sz="4"/>
+              <w:right w:val="single" w:color="BFBFBF" w:sz="4"/>
+            </w:tcBorders>
+            <w:tcMar>
+              <w:top w:type="dxa" w:w="60"/>
+              <w:left w:type="dxa" w:w="100"/>
+              <w:bottom w:type="dxa" w:w="60"/>
+              <w:right w:type="dxa" w:w="100"/>
+            </w:tcMar>
+          </w:tcPr>
+          <w:p>
+            <w:pPr>
+              <w:keepNext w:val="false"/>
+              <w:keepLines/>
+              <w:spacing w:after="40"/>
+            </w:pPr>
+            <w:r>
+              <w:rPr>
+                <w:rFonts w:ascii="Calibri" w:cs="Calibri" w:eastAsia="Calibri" w:hAnsi="Calibri"/>
+                <w:b w:val="false"/>
+                <w:bCs w:val="false"/>
+                <w:sz w:val="20"/>
+                <w:szCs w:val="20"/>
+              </w:rPr>
+              <w:t xml:space="preserve">Low</w:t>
+            </w:r>
+          </w:p>
+        </w:tc>
+        <w:tc>
+          <w:tcPr>
+            <w:tcW w:type="dxa" w:w="1700"/>
+            <w:tcBorders>
+              <w:top w:val="single" w:color="BFBFBF" w:sz="4"/>
+              <w:left w:val="single" w:color="BFBFBF" w:sz="4"/>
+              <w:bottom w:val="single" w:color="BFBFBF" w:sz="4"/>
+              <w:right w:val="single" w:color="BFBFBF" w:sz="4"/>
+            </w:tcBorders>
+            <w:tcMar>
+              <w:top w:type="dxa" w:w="60"/>
+              <w:left w:type="dxa" w:w="100"/>
+              <w:bottom w:type="dxa" w:w="60"/>
+              <w:right w:type="dxa" w:w="100"/>
+            </w:tcMar>
+          </w:tcPr>
+          <w:p>
+            <w:pPr>
+              <w:keepNext w:val="false"/>
+              <w:keepLines/>
+              <w:spacing w:after="40"/>
+            </w:pPr>
+            <w:r>
+              <w:rPr>
+                <w:rFonts w:ascii="Calibri" w:cs="Calibri" w:eastAsia="Calibri" w:hAnsi="Calibri"/>
+                <w:b w:val="false"/>
+                <w:bCs w:val="false"/>
+                <w:sz w:val="20"/>
+                <w:szCs w:val="20"/>
+              </w:rPr>
+              <w:t xml:space="preserve">Accepted as suggested</w:t>
             </w:r>
           </w:p>
         </w:tc>
@@ -3458,7 +4209,7 @@
                 <w:sz w:val="20"/>
                 <w:szCs w:val="20"/>
               </w:rPr>
-              <w:t xml:space="preserve">Low</w:t>
+              <w:t xml:space="preserve">59</w:t>
             </w:r>
           </w:p>
         </w:tc>
@@ -3970,7 +4721,41 @@
                 <w:sz w:val="20"/>
                 <w:szCs w:val="20"/>
               </w:rPr>
-              <w:t xml:space="preserve"/>
+              <w:t xml:space="preserve">Accepted, with these specifics.</w:t>
+            </w:r>
+          </w:p>
+          <w:p>
+            <w:pPr>
+              <w:keepNext w:val="false"/>
+              <w:keepLines/>
+              <w:spacing w:after="40"/>
+            </w:pPr>
+            <w:r>
+              <w:rPr>
+                <w:rFonts w:ascii="Calibri" w:cs="Calibri" w:eastAsia="Calibri" w:hAnsi="Calibri"/>
+                <w:b w:val="false"/>
+                <w:bCs w:val="false"/>
+                <w:sz w:val="20"/>
+                <w:szCs w:val="20"/>
+              </w:rPr>
+              <w:t xml:space="preserve">Agreed: Signed-out visitors see a summary of each listing only: cover photo, rent, area, number of rooms and badges. Everything else (photo gallery, walkthrough, details, map position, contact, saving and alerts) needs an account.</w:t>
+            </w:r>
+          </w:p>
+          <w:p>
+            <w:pPr>
+              <w:keepNext w:val="false"/>
+              <w:keepLines/>
+              <w:spacing w:after="40"/>
+            </w:pPr>
+            <w:r>
+              <w:rPr>
+                <w:rFonts w:ascii="Calibri" w:cs="Calibri" w:eastAsia="Calibri" w:hAnsi="Calibri"/>
+                <w:b w:val="false"/>
+                <w:bCs w:val="false"/>
+                <w:sz w:val="20"/>
+                <w:szCs w:val="20"/>
+              </w:rPr>
+              <w:t xml:space="preserve">Decided by Emmanuel on 23 October 2026. Recorded in the Decisions Log as decision 39.</w:t>
             </w:r>
           </w:p>
         </w:tc>
@@ -4450,7 +5235,41 @@
                 <w:sz w:val="20"/>
                 <w:szCs w:val="20"/>
               </w:rPr>
-              <w:t xml:space="preserve"/>
+              <w:t xml:space="preserve">Accepted, with these specifics.</w:t>
+            </w:r>
+          </w:p>
+          <w:p>
+            <w:pPr>
+              <w:keepNext w:val="false"/>
+              <w:keepLines/>
+              <w:spacing w:after="40"/>
+            </w:pPr>
+            <w:r>
+              <w:rPr>
+                <w:rFonts w:ascii="Calibri" w:cs="Calibri" w:eastAsia="Calibri" w:hAnsi="Calibri"/>
+                <w:b w:val="false"/>
+                <w:bCs w:val="false"/>
+                <w:sz w:val="20"/>
+                <w:szCs w:val="20"/>
+              </w:rPr>
+              <w:t xml:space="preserve">Agreed: English and Pidgin are switched on at launch. Each user chooses their language in their settings, from the languages switched on for their country. Other languages (Yoruba, Igbo, Hausa, French) are added to that list when their translations are ready and checked.</w:t>
+            </w:r>
+          </w:p>
+          <w:p>
+            <w:pPr>
+              <w:keepNext w:val="false"/>
+              <w:keepLines/>
+              <w:spacing w:after="40"/>
+            </w:pPr>
+            <w:r>
+              <w:rPr>
+                <w:rFonts w:ascii="Calibri" w:cs="Calibri" w:eastAsia="Calibri" w:hAnsi="Calibri"/>
+                <w:b w:val="false"/>
+                <w:bCs w:val="false"/>
+                <w:sz w:val="20"/>
+                <w:szCs w:val="20"/>
+              </w:rPr>
+              <w:t xml:space="preserve">Decided by Emmanuel on 23 October 2026. Recorded in the Decisions Log as decision 40.</w:t>
             </w:r>
           </w:p>
         </w:tc>
@@ -4930,7 +5749,41 @@
                 <w:sz w:val="20"/>
                 <w:szCs w:val="20"/>
               </w:rPr>
-              <w:t xml:space="preserve"/>
+              <w:t xml:space="preserve">Accepted, with these specifics.</w:t>
+            </w:r>
+          </w:p>
+          <w:p>
+            <w:pPr>
+              <w:keepNext w:val="false"/>
+              <w:keepLines/>
+              <w:spacing w:after="40"/>
+            </w:pPr>
+            <w:r>
+              <w:rPr>
+                <w:rFonts w:ascii="Calibri" w:cs="Calibri" w:eastAsia="Calibri" w:hAnsi="Calibri"/>
+                <w:b w:val="false"/>
+                <w:bCs w:val="false"/>
+                <w:sz w:val="20"/>
+                <w:szCs w:val="20"/>
+              </w:rPr>
+              <w:t xml:space="preserve">Agreed: At launch: a help page in the app and website, plus WhatsApp and phone lines run by the support team. In-app support chat and tickets come in Release 2.</w:t>
+            </w:r>
+          </w:p>
+          <w:p>
+            <w:pPr>
+              <w:keepNext w:val="false"/>
+              <w:keepLines/>
+              <w:spacing w:after="40"/>
+            </w:pPr>
+            <w:r>
+              <w:rPr>
+                <w:rFonts w:ascii="Calibri" w:cs="Calibri" w:eastAsia="Calibri" w:hAnsi="Calibri"/>
+                <w:b w:val="false"/>
+                <w:bCs w:val="false"/>
+                <w:sz w:val="20"/>
+                <w:szCs w:val="20"/>
+              </w:rPr>
+              <w:t xml:space="preserve">Decided by Emmanuel on 23 October 2026. Recorded in the Decisions Log as decision 41.</w:t>
             </w:r>
           </w:p>
         </w:tc>
@@ -5410,7 +6263,41 @@
                 <w:sz w:val="20"/>
                 <w:szCs w:val="20"/>
               </w:rPr>
-              <w:t xml:space="preserve"/>
+              <w:t xml:space="preserve">Decided as follows.</w:t>
+            </w:r>
+          </w:p>
+          <w:p>
+            <w:pPr>
+              <w:keepNext w:val="false"/>
+              <w:keepLines/>
+              <w:spacing w:after="40"/>
+            </w:pPr>
+            <w:r>
+              <w:rPr>
+                <w:rFonts w:ascii="Calibri" w:cs="Calibri" w:eastAsia="Calibri" w:hAnsi="Calibri"/>
+                <w:b w:val="false"/>
+                <w:bCs w:val="false"/>
+                <w:sz w:val="20"/>
+                <w:szCs w:val="20"/>
+              </w:rPr>
+              <w:t xml:space="preserve">Agreed: There will be no human designer. The screen designs are produced in the build sessions using the Figma connector, as a separate step, for Emmanuel's review and approval before the app screens are built. The hosting account (and so the test system) follows once the company has a dollar card.</w:t>
+            </w:r>
+          </w:p>
+          <w:p>
+            <w:pPr>
+              <w:keepNext w:val="false"/>
+              <w:keepLines/>
+              <w:spacing w:after="40"/>
+            </w:pPr>
+            <w:r>
+              <w:rPr>
+                <w:rFonts w:ascii="Calibri" w:cs="Calibri" w:eastAsia="Calibri" w:hAnsi="Calibri"/>
+                <w:b w:val="false"/>
+                <w:bCs w:val="false"/>
+                <w:sz w:val="20"/>
+                <w:szCs w:val="20"/>
+              </w:rPr>
+              <w:t xml:space="preserve">Decided by Emmanuel on 23 October 2026. Recorded in the Decisions Log as decision 42.</w:t>
             </w:r>
           </w:p>
         </w:tc>
@@ -5890,7 +6777,41 @@
                 <w:sz w:val="20"/>
                 <w:szCs w:val="20"/>
               </w:rPr>
-              <w:t xml:space="preserve"/>
+              <w:t xml:space="preserve">Decided differently from the suggestion.</w:t>
+            </w:r>
+          </w:p>
+          <w:p>
+            <w:pPr>
+              <w:keepNext w:val="false"/>
+              <w:keepLines/>
+              <w:spacing w:after="40"/>
+            </w:pPr>
+            <w:r>
+              <w:rPr>
+                <w:rFonts w:ascii="Calibri" w:cs="Calibri" w:eastAsia="Calibri" w:hAnsi="Calibri"/>
+                <w:b w:val="false"/>
+                <w:bCs w:val="false"/>
+                <w:sz w:val="20"/>
+                <w:szCs w:val="20"/>
+              </w:rPr>
+              <w:t xml:space="preserve">Agreed: Landlords do all of their own building registration; the platform does not register properties for them. Field officers only carry out verification checks, because the manpower needed for the platform to register properties itself is not realistic. This replaces field-team property capture in Specification Section 20 and Technical Architecture Sections 3 and 5.</w:t>
+            </w:r>
+          </w:p>
+          <w:p>
+            <w:pPr>
+              <w:keepNext w:val="false"/>
+              <w:keepLines/>
+              <w:spacing w:after="40"/>
+            </w:pPr>
+            <w:r>
+              <w:rPr>
+                <w:rFonts w:ascii="Calibri" w:cs="Calibri" w:eastAsia="Calibri" w:hAnsi="Calibri"/>
+                <w:b w:val="false"/>
+                <w:bCs w:val="false"/>
+                <w:sz w:val="20"/>
+                <w:szCs w:val="20"/>
+              </w:rPr>
+              <w:t xml:space="preserve">Decided by Emmanuel on 23 October 2026. Recorded in the Decisions Log as decision 43.</w:t>
             </w:r>
           </w:p>
         </w:tc>
@@ -6402,7 +7323,41 @@
                 <w:sz w:val="20"/>
                 <w:szCs w:val="20"/>
               </w:rPr>
-              <w:t xml:space="preserve"/>
+              <w:t xml:space="preserve">Decided differently from the suggestion.</w:t>
+            </w:r>
+          </w:p>
+          <w:p>
+            <w:pPr>
+              <w:keepNext w:val="false"/>
+              <w:keepLines/>
+              <w:spacing w:after="40"/>
+            </w:pPr>
+            <w:r>
+              <w:rPr>
+                <w:rFonts w:ascii="Calibri" w:cs="Calibri" w:eastAsia="Calibri" w:hAnsi="Calibri"/>
+                <w:b w:val="false"/>
+                <w:bCs w:val="false"/>
+                <w:sz w:val="20"/>
+                <w:szCs w:val="20"/>
+              </w:rPr>
+              <w:t xml:space="preserve">Agreed: Calling inside the app (voice calls over the internet, with phone numbers kept hidden) is part of Release 1.</w:t>
+            </w:r>
+          </w:p>
+          <w:p>
+            <w:pPr>
+              <w:keepNext w:val="false"/>
+              <w:keepLines/>
+              <w:spacing w:after="40"/>
+            </w:pPr>
+            <w:r>
+              <w:rPr>
+                <w:rFonts w:ascii="Calibri" w:cs="Calibri" w:eastAsia="Calibri" w:hAnsi="Calibri"/>
+                <w:b w:val="false"/>
+                <w:bCs w:val="false"/>
+                <w:sz w:val="20"/>
+                <w:szCs w:val="20"/>
+              </w:rPr>
+              <w:t xml:space="preserve">Decided by Emmanuel on 23 October 2026. Recorded in the Decisions Log as decision 44.</w:t>
             </w:r>
           </w:p>
         </w:tc>
@@ -6882,7 +7837,41 @@
                 <w:sz w:val="20"/>
                 <w:szCs w:val="20"/>
               </w:rPr>
-              <w:t xml:space="preserve"/>
+              <w:t xml:space="preserve">Accepted as suggested.</w:t>
+            </w:r>
+          </w:p>
+          <w:p>
+            <w:pPr>
+              <w:keepNext w:val="false"/>
+              <w:keepLines/>
+              <w:spacing w:after="40"/>
+            </w:pPr>
+            <w:r>
+              <w:rPr>
+                <w:rFonts w:ascii="Calibri" w:cs="Calibri" w:eastAsia="Calibri" w:hAnsi="Calibri"/>
+                <w:b w:val="false"/>
+                <w:bCs w:val="false"/>
+                <w:sz w:val="20"/>
+                <w:szCs w:val="20"/>
+              </w:rPr>
+              <w:t xml:space="preserve">Agreed: Landlords and agents set the times they are available for inspections; tenants book by choosing one of the free time slots. The lister then confirms or reschedules as designed.</w:t>
+            </w:r>
+          </w:p>
+          <w:p>
+            <w:pPr>
+              <w:keepNext w:val="false"/>
+              <w:keepLines/>
+              <w:spacing w:after="40"/>
+            </w:pPr>
+            <w:r>
+              <w:rPr>
+                <w:rFonts w:ascii="Calibri" w:cs="Calibri" w:eastAsia="Calibri" w:hAnsi="Calibri"/>
+                <w:b w:val="false"/>
+                <w:bCs w:val="false"/>
+                <w:sz w:val="20"/>
+                <w:szCs w:val="20"/>
+              </w:rPr>
+              <w:t xml:space="preserve">Decided by Emmanuel on 23 October 2026. Recorded in the Decisions Log as decision 45.</w:t>
             </w:r>
           </w:p>
         </w:tc>
@@ -7362,7 +8351,41 @@
                 <w:sz w:val="20"/>
                 <w:szCs w:val="20"/>
               </w:rPr>
-              <w:t xml:space="preserve"/>
+              <w:t xml:space="preserve">Accepted as suggested.</w:t>
+            </w:r>
+          </w:p>
+          <w:p>
+            <w:pPr>
+              <w:keepNext w:val="false"/>
+              <w:keepLines/>
+              <w:spacing w:after="40"/>
+            </w:pPr>
+            <w:r>
+              <w:rPr>
+                <w:rFonts w:ascii="Calibri" w:cs="Calibri" w:eastAsia="Calibri" w:hAnsi="Calibri"/>
+                <w:b w:val="false"/>
+                <w:bCs w:val="false"/>
+                <w:sz w:val="20"/>
+                <w:szCs w:val="20"/>
+              </w:rPr>
+              <w:t xml:space="preserve">Agreed: Release 1 includes push notifications (each phone registered for them) and notification settings for each user: which notifications they receive and by which channel (push, email or SMS). Security messages (codes and sign-in alerts) cannot be switched off.</w:t>
+            </w:r>
+          </w:p>
+          <w:p>
+            <w:pPr>
+              <w:keepNext w:val="false"/>
+              <w:keepLines/>
+              <w:spacing w:after="40"/>
+            </w:pPr>
+            <w:r>
+              <w:rPr>
+                <w:rFonts w:ascii="Calibri" w:cs="Calibri" w:eastAsia="Calibri" w:hAnsi="Calibri"/>
+                <w:b w:val="false"/>
+                <w:bCs w:val="false"/>
+                <w:sz w:val="20"/>
+                <w:szCs w:val="20"/>
+              </w:rPr>
+              <w:t xml:space="preserve">Decided by Emmanuel on 23 October 2026. Recorded in the Decisions Log as decision 46.</w:t>
             </w:r>
           </w:p>
         </w:tc>
@@ -7842,7 +8865,41 @@
                 <w:sz w:val="20"/>
                 <w:szCs w:val="20"/>
               </w:rPr>
-              <w:t xml:space="preserve"/>
+              <w:t xml:space="preserve">Accepted as suggested.</w:t>
+            </w:r>
+          </w:p>
+          <w:p>
+            <w:pPr>
+              <w:keepNext w:val="false"/>
+              <w:keepLines/>
+              <w:spacing w:after="40"/>
+            </w:pPr>
+            <w:r>
+              <w:rPr>
+                <w:rFonts w:ascii="Calibri" w:cs="Calibri" w:eastAsia="Calibri" w:hAnsi="Calibri"/>
+                <w:b w:val="false"/>
+                <w:bCs w:val="false"/>
+                <w:sz w:val="20"/>
+                <w:szCs w:val="20"/>
+              </w:rPr>
+              <w:t xml:space="preserve">Agreed: Release 1 includes a live connection for chat messages and inspection status, with push notifications when the app is closed.</w:t>
+            </w:r>
+          </w:p>
+          <w:p>
+            <w:pPr>
+              <w:keepNext w:val="false"/>
+              <w:keepLines/>
+              <w:spacing w:after="40"/>
+            </w:pPr>
+            <w:r>
+              <w:rPr>
+                <w:rFonts w:ascii="Calibri" w:cs="Calibri" w:eastAsia="Calibri" w:hAnsi="Calibri"/>
+                <w:b w:val="false"/>
+                <w:bCs w:val="false"/>
+                <w:sz w:val="20"/>
+                <w:szCs w:val="20"/>
+              </w:rPr>
+              <w:t xml:space="preserve">Decided by Emmanuel on 23 October 2026. Recorded in the Decisions Log as decision 47.</w:t>
             </w:r>
           </w:p>
         </w:tc>
@@ -8322,7 +9379,41 @@
                 <w:sz w:val="20"/>
                 <w:szCs w:val="20"/>
               </w:rPr>
-              <w:t xml:space="preserve"/>
+              <w:t xml:space="preserve">Accepted as suggested.</w:t>
+            </w:r>
+          </w:p>
+          <w:p>
+            <w:pPr>
+              <w:keepNext w:val="false"/>
+              <w:keepLines/>
+              <w:spacing w:after="40"/>
+            </w:pPr>
+            <w:r>
+              <w:rPr>
+                <w:rFonts w:ascii="Calibri" w:cs="Calibri" w:eastAsia="Calibri" w:hAnsi="Calibri"/>
+                <w:b w:val="false"/>
+                <w:bCs w:val="false"/>
+                <w:sz w:val="20"/>
+                <w:szCs w:val="20"/>
+              </w:rPr>
+              <w:t xml:space="preserve">Agreed: Tenants can save places of their choosing (a name and a location, such as an office or school), and the property page shows the travel distance to them. Built in Release 1 step 5 or later in Release 1.</w:t>
+            </w:r>
+          </w:p>
+          <w:p>
+            <w:pPr>
+              <w:keepNext w:val="false"/>
+              <w:keepLines/>
+              <w:spacing w:after="40"/>
+            </w:pPr>
+            <w:r>
+              <w:rPr>
+                <w:rFonts w:ascii="Calibri" w:cs="Calibri" w:eastAsia="Calibri" w:hAnsi="Calibri"/>
+                <w:b w:val="false"/>
+                <w:bCs w:val="false"/>
+                <w:sz w:val="20"/>
+                <w:szCs w:val="20"/>
+              </w:rPr>
+              <w:t xml:space="preserve">Decided by Emmanuel on 23 October 2026. Recorded in the Decisions Log as decision 48.</w:t>
             </w:r>
           </w:p>
         </w:tc>
@@ -8802,7 +9893,41 @@
                 <w:sz w:val="20"/>
                 <w:szCs w:val="20"/>
               </w:rPr>
-              <w:t xml:space="preserve"/>
+              <w:t xml:space="preserve">Decided as follows.</w:t>
+            </w:r>
+          </w:p>
+          <w:p>
+            <w:pPr>
+              <w:keepNext w:val="false"/>
+              <w:keepLines/>
+              <w:spacing w:after="40"/>
+            </w:pPr>
+            <w:r>
+              <w:rPr>
+                <w:rFonts w:ascii="Calibri" w:cs="Calibri" w:eastAsia="Calibri" w:hAnsi="Calibri"/>
+                <w:b w:val="false"/>
+                <w:bCs w:val="false"/>
+                <w:sz w:val="20"/>
+                <w:szCs w:val="20"/>
+              </w:rPr>
+              <w:t xml:space="preserve">Agreed: No document photo is asked for by default at level 2. A document photo is asked for only when the NIN check fails or the details do not match. Accepted documents: driver's licence, international passport and NIN slip. (Settles open point 14.)</w:t>
+            </w:r>
+          </w:p>
+          <w:p>
+            <w:pPr>
+              <w:keepNext w:val="false"/>
+              <w:keepLines/>
+              <w:spacing w:after="40"/>
+            </w:pPr>
+            <w:r>
+              <w:rPr>
+                <w:rFonts w:ascii="Calibri" w:cs="Calibri" w:eastAsia="Calibri" w:hAnsi="Calibri"/>
+                <w:b w:val="false"/>
+                <w:bCs w:val="false"/>
+                <w:sz w:val="20"/>
+                <w:szCs w:val="20"/>
+              </w:rPr>
+              <w:t xml:space="preserve">Decided by Emmanuel on 23 October 2026. Recorded in the Decisions Log as decision 49.</w:t>
             </w:r>
           </w:p>
         </w:tc>
@@ -9282,7 +10407,41 @@
                 <w:sz w:val="20"/>
                 <w:szCs w:val="20"/>
               </w:rPr>
-              <w:t xml:space="preserve"/>
+              <w:t xml:space="preserve">Accepted as suggested.</w:t>
+            </w:r>
+          </w:p>
+          <w:p>
+            <w:pPr>
+              <w:keepNext w:val="false"/>
+              <w:keepLines/>
+              <w:spacing w:after="40"/>
+            </w:pPr>
+            <w:r>
+              <w:rPr>
+                <w:rFonts w:ascii="Calibri" w:cs="Calibri" w:eastAsia="Calibri" w:hAnsi="Calibri"/>
+                <w:b w:val="false"/>
+                <w:bCs w:val="false"/>
+                <w:sz w:val="20"/>
+                <w:szCs w:val="20"/>
+              </w:rPr>
+              <w:t xml:space="preserve">Agreed: Agents can add their company details (business name and registration number) to their profile in Release 1 step 3, checked by the verification team.</w:t>
+            </w:r>
+          </w:p>
+          <w:p>
+            <w:pPr>
+              <w:keepNext w:val="false"/>
+              <w:keepLines/>
+              <w:spacing w:after="40"/>
+            </w:pPr>
+            <w:r>
+              <w:rPr>
+                <w:rFonts w:ascii="Calibri" w:cs="Calibri" w:eastAsia="Calibri" w:hAnsi="Calibri"/>
+                <w:b w:val="false"/>
+                <w:bCs w:val="false"/>
+                <w:sz w:val="20"/>
+                <w:szCs w:val="20"/>
+              </w:rPr>
+              <w:t xml:space="preserve">Decided by Emmanuel on 23 October 2026. Recorded in the Decisions Log as decision 50.</w:t>
             </w:r>
           </w:p>
         </w:tc>
@@ -9762,7 +10921,41 @@
                 <w:sz w:val="20"/>
                 <w:szCs w:val="20"/>
               </w:rPr>
-              <w:t xml:space="preserve"/>
+              <w:t xml:space="preserve">Accepted as suggested.</w:t>
+            </w:r>
+          </w:p>
+          <w:p>
+            <w:pPr>
+              <w:keepNext w:val="false"/>
+              <w:keepLines/>
+              <w:spacing w:after="40"/>
+            </w:pPr>
+            <w:r>
+              <w:rPr>
+                <w:rFonts w:ascii="Calibri" w:cs="Calibri" w:eastAsia="Calibri" w:hAnsi="Calibri"/>
+                <w:b w:val="false"/>
+                <w:bCs w:val="false"/>
+                <w:sz w:val="20"/>
+                <w:szCs w:val="20"/>
+              </w:rPr>
+              <w:t xml:space="preserve">Agreed: Staff review decisions can also remove a verified badge and ban a user, each recorded against the user's verified identity.</w:t>
+            </w:r>
+          </w:p>
+          <w:p>
+            <w:pPr>
+              <w:keepNext w:val="false"/>
+              <w:keepLines/>
+              <w:spacing w:after="40"/>
+            </w:pPr>
+            <w:r>
+              <w:rPr>
+                <w:rFonts w:ascii="Calibri" w:cs="Calibri" w:eastAsia="Calibri" w:hAnsi="Calibri"/>
+                <w:b w:val="false"/>
+                <w:bCs w:val="false"/>
+                <w:sz w:val="20"/>
+                <w:szCs w:val="20"/>
+              </w:rPr>
+              <w:t xml:space="preserve">Decided by Emmanuel on 23 October 2026. Recorded in the Decisions Log as decision 51.</w:t>
             </w:r>
           </w:p>
         </w:tc>
@@ -10242,7 +11435,41 @@
                 <w:sz w:val="20"/>
                 <w:szCs w:val="20"/>
               </w:rPr>
-              <w:t xml:space="preserve"/>
+              <w:t xml:space="preserve">Accepted as suggested.</w:t>
+            </w:r>
+          </w:p>
+          <w:p>
+            <w:pPr>
+              <w:keepNext w:val="false"/>
+              <w:keepLines/>
+              <w:spacing w:after="40"/>
+            </w:pPr>
+            <w:r>
+              <w:rPr>
+                <w:rFonts w:ascii="Calibri" w:cs="Calibri" w:eastAsia="Calibri" w:hAnsi="Calibri"/>
+                <w:b w:val="false"/>
+                <w:bCs w:val="false"/>
+                <w:sz w:val="20"/>
+                <w:szCs w:val="20"/>
+              </w:rPr>
+              <w:t xml:space="preserve">Agreed: Limits per account on viewing listings and photos, counted in Redis so every server shares them, are built with search and the property page.</w:t>
+            </w:r>
+          </w:p>
+          <w:p>
+            <w:pPr>
+              <w:keepNext w:val="false"/>
+              <w:keepLines/>
+              <w:spacing w:after="40"/>
+            </w:pPr>
+            <w:r>
+              <w:rPr>
+                <w:rFonts w:ascii="Calibri" w:cs="Calibri" w:eastAsia="Calibri" w:hAnsi="Calibri"/>
+                <w:b w:val="false"/>
+                <w:bCs w:val="false"/>
+                <w:sz w:val="20"/>
+                <w:szCs w:val="20"/>
+              </w:rPr>
+              <w:t xml:space="preserve">Decided by Emmanuel on 23 October 2026. Recorded in the Decisions Log as decision 52.</w:t>
             </w:r>
           </w:p>
         </w:tc>
@@ -10722,7 +11949,41 @@
                 <w:sz w:val="20"/>
                 <w:szCs w:val="20"/>
               </w:rPr>
-              <w:t xml:space="preserve"/>
+              <w:t xml:space="preserve">Accepted as suggested.</w:t>
+            </w:r>
+          </w:p>
+          <w:p>
+            <w:pPr>
+              <w:keepNext w:val="false"/>
+              <w:keepLines/>
+              <w:spacing w:after="40"/>
+            </w:pPr>
+            <w:r>
+              <w:rPr>
+                <w:rFonts w:ascii="Calibri" w:cs="Calibri" w:eastAsia="Calibri" w:hAnsi="Calibri"/>
+                <w:b w:val="false"/>
+                <w:bCs w:val="false"/>
+                <w:sz w:val="20"/>
+                <w:szCs w:val="20"/>
+              </w:rPr>
+              <w:t xml:space="preserve">Agreed: A switch rule can carry an optional message and return time shown to users, and the admin panel warns when switching off a feature that others depend on. Built with the admin screens.</w:t>
+            </w:r>
+          </w:p>
+          <w:p>
+            <w:pPr>
+              <w:keepNext w:val="false"/>
+              <w:keepLines/>
+              <w:spacing w:after="40"/>
+            </w:pPr>
+            <w:r>
+              <w:rPr>
+                <w:rFonts w:ascii="Calibri" w:cs="Calibri" w:eastAsia="Calibri" w:hAnsi="Calibri"/>
+                <w:b w:val="false"/>
+                <w:bCs w:val="false"/>
+                <w:sz w:val="20"/>
+                <w:szCs w:val="20"/>
+              </w:rPr>
+              <w:t xml:space="preserve">Decided by Emmanuel on 23 October 2026. Recorded in the Decisions Log as decision 53.</w:t>
             </w:r>
           </w:p>
         </w:tc>
@@ -11202,7 +12463,41 @@
                 <w:sz w:val="20"/>
                 <w:szCs w:val="20"/>
               </w:rPr>
-              <w:t xml:space="preserve"/>
+              <w:t xml:space="preserve">Accepted as suggested.</w:t>
+            </w:r>
+          </w:p>
+          <w:p>
+            <w:pPr>
+              <w:keepNext w:val="false"/>
+              <w:keepLines/>
+              <w:spacing w:after="40"/>
+            </w:pPr>
+            <w:r>
+              <w:rPr>
+                <w:rFonts w:ascii="Calibri" w:cs="Calibri" w:eastAsia="Calibri" w:hAnsi="Calibri"/>
+                <w:b w:val="false"/>
+                <w:bCs w:val="false"/>
+                <w:sz w:val="20"/>
+                <w:szCs w:val="20"/>
+              </w:rPr>
+              <w:t xml:space="preserve">Agreed: Blocking restricted countries is added before a second country is opened (Release 3).</w:t>
+            </w:r>
+          </w:p>
+          <w:p>
+            <w:pPr>
+              <w:keepNext w:val="false"/>
+              <w:keepLines/>
+              <w:spacing w:after="40"/>
+            </w:pPr>
+            <w:r>
+              <w:rPr>
+                <w:rFonts w:ascii="Calibri" w:cs="Calibri" w:eastAsia="Calibri" w:hAnsi="Calibri"/>
+                <w:b w:val="false"/>
+                <w:bCs w:val="false"/>
+                <w:sz w:val="20"/>
+                <w:szCs w:val="20"/>
+              </w:rPr>
+              <w:t xml:space="preserve">Decided by Emmanuel on 23 October 2026. Recorded in the Decisions Log as decision 54.</w:t>
             </w:r>
           </w:p>
         </w:tc>
@@ -11682,7 +12977,41 @@
                 <w:sz w:val="20"/>
                 <w:szCs w:val="20"/>
               </w:rPr>
-              <w:t xml:space="preserve"/>
+              <w:t xml:space="preserve">Accepted, with these specifics.</w:t>
+            </w:r>
+          </w:p>
+          <w:p>
+            <w:pPr>
+              <w:keepNext w:val="false"/>
+              <w:keepLines/>
+              <w:spacing w:after="40"/>
+            </w:pPr>
+            <w:r>
+              <w:rPr>
+                <w:rFonts w:ascii="Calibri" w:cs="Calibri" w:eastAsia="Calibri" w:hAnsi="Calibri"/>
+                <w:b w:val="false"/>
+                <w:bCs w:val="false"/>
+                <w:sz w:val="20"/>
+                <w:szCs w:val="20"/>
+              </w:rPr>
+              <w:t xml:space="preserve">Agreed: Data retention becomes a country setting in Release 1 step 3, with the period set after legal advice (open point 15). Other country settings are added with the features that need them: fee types shown on listings in step 5, the rest in Releases 2 and 3. The fixed fee fields remain for Release 1 in Nigeria.</w:t>
+            </w:r>
+          </w:p>
+          <w:p>
+            <w:pPr>
+              <w:keepNext w:val="false"/>
+              <w:keepLines/>
+              <w:spacing w:after="40"/>
+            </w:pPr>
+            <w:r>
+              <w:rPr>
+                <w:rFonts w:ascii="Calibri" w:cs="Calibri" w:eastAsia="Calibri" w:hAnsi="Calibri"/>
+                <w:b w:val="false"/>
+                <w:bCs w:val="false"/>
+                <w:sz w:val="20"/>
+                <w:szCs w:val="20"/>
+              </w:rPr>
+              <w:t xml:space="preserve">Decided by Emmanuel on 23 October 2026. Recorded in the Decisions Log as decision 55.</w:t>
             </w:r>
           </w:p>
         </w:tc>
@@ -12162,7 +13491,41 @@
                 <w:sz w:val="20"/>
                 <w:szCs w:val="20"/>
               </w:rPr>
-              <w:t xml:space="preserve"/>
+              <w:t xml:space="preserve">Accepted as suggested.</w:t>
+            </w:r>
+          </w:p>
+          <w:p>
+            <w:pPr>
+              <w:keepNext w:val="false"/>
+              <w:keepLines/>
+              <w:spacing w:after="40"/>
+            </w:pPr>
+            <w:r>
+              <w:rPr>
+                <w:rFonts w:ascii="Calibri" w:cs="Calibri" w:eastAsia="Calibri" w:hAnsi="Calibri"/>
+                <w:b w:val="false"/>
+                <w:bCs w:val="false"/>
+                <w:sz w:val="20"/>
+                <w:szCs w:val="20"/>
+              </w:rPr>
+              <w:t xml:space="preserve">Agreed: In Release 1 step 4: the distance to the main road is recorded; the residential photo checklist asks for separate toilets; and each part can carry a note.</w:t>
+            </w:r>
+          </w:p>
+          <w:p>
+            <w:pPr>
+              <w:keepNext w:val="false"/>
+              <w:keepLines/>
+              <w:spacing w:after="40"/>
+            </w:pPr>
+            <w:r>
+              <w:rPr>
+                <w:rFonts w:ascii="Calibri" w:cs="Calibri" w:eastAsia="Calibri" w:hAnsi="Calibri"/>
+                <w:b w:val="false"/>
+                <w:bCs w:val="false"/>
+                <w:sz w:val="20"/>
+                <w:szCs w:val="20"/>
+              </w:rPr>
+              <w:t xml:space="preserve">Decided by Emmanuel on 23 October 2026. Recorded in the Decisions Log as decision 56.</w:t>
             </w:r>
           </w:p>
         </w:tc>
@@ -12674,7 +14037,41 @@
                 <w:sz w:val="20"/>
                 <w:szCs w:val="20"/>
               </w:rPr>
-              <w:t xml:space="preserve"/>
+              <w:t xml:space="preserve">Accepted, with these specifics.</w:t>
+            </w:r>
+          </w:p>
+          <w:p>
+            <w:pPr>
+              <w:keepNext w:val="false"/>
+              <w:keepLines/>
+              <w:spacing w:after="40"/>
+            </w:pPr>
+            <w:r>
+              <w:rPr>
+                <w:rFonts w:ascii="Calibri" w:cs="Calibri" w:eastAsia="Calibri" w:hAnsi="Calibri"/>
+                <w:b w:val="false"/>
+                <w:bCs w:val="false"/>
+                <w:sz w:val="20"/>
+                <w:szCs w:val="20"/>
+              </w:rPr>
+              <w:t xml:space="preserve">Agreed: Ratings and reviews come in Release 2, with escrow and short lets.</w:t>
+            </w:r>
+          </w:p>
+          <w:p>
+            <w:pPr>
+              <w:keepNext w:val="false"/>
+              <w:keepLines/>
+              <w:spacing w:after="40"/>
+            </w:pPr>
+            <w:r>
+              <w:rPr>
+                <w:rFonts w:ascii="Calibri" w:cs="Calibri" w:eastAsia="Calibri" w:hAnsi="Calibri"/>
+                <w:b w:val="false"/>
+                <w:bCs w:val="false"/>
+                <w:sz w:val="20"/>
+                <w:szCs w:val="20"/>
+              </w:rPr>
+              <w:t xml:space="preserve">Decided by Emmanuel on 23 October 2026. Recorded in the Decisions Log as decision 57.</w:t>
             </w:r>
           </w:p>
         </w:tc>
@@ -13154,7 +14551,41 @@
                 <w:sz w:val="20"/>
                 <w:szCs w:val="20"/>
               </w:rPr>
-              <w:t xml:space="preserve"/>
+              <w:t xml:space="preserve">Accepted as suggested.</w:t>
+            </w:r>
+          </w:p>
+          <w:p>
+            <w:pPr>
+              <w:keepNext w:val="false"/>
+              <w:keepLines/>
+              <w:spacing w:after="40"/>
+            </w:pPr>
+            <w:r>
+              <w:rPr>
+                <w:rFonts w:ascii="Calibri" w:cs="Calibri" w:eastAsia="Calibri" w:hAnsi="Calibri"/>
+                <w:b w:val="false"/>
+                <w:bCs w:val="false"/>
+                <w:sz w:val="20"/>
+                <w:szCs w:val="20"/>
+              </w:rPr>
+              <w:t xml:space="preserve">Agreed: Release 1: live photo check, walkthrough video GPS path, all duplicate checks (location, photo fingerprint, document numbers and address), and name match by the verification team. Release 2: satellite check and stolen photo check.</w:t>
+            </w:r>
+          </w:p>
+          <w:p>
+            <w:pPr>
+              <w:keepNext w:val="false"/>
+              <w:keepLines/>
+              <w:spacing w:after="40"/>
+            </w:pPr>
+            <w:r>
+              <w:rPr>
+                <w:rFonts w:ascii="Calibri" w:cs="Calibri" w:eastAsia="Calibri" w:hAnsi="Calibri"/>
+                <w:b w:val="false"/>
+                <w:bCs w:val="false"/>
+                <w:sz w:val="20"/>
+                <w:szCs w:val="20"/>
+              </w:rPr>
+              <w:t xml:space="preserve">Decided by Emmanuel on 23 October 2026. Recorded in the Decisions Log as decision 58.</w:t>
             </w:r>
           </w:p>
         </w:tc>
@@ -13666,7 +15097,41 @@
                 <w:sz w:val="20"/>
                 <w:szCs w:val="20"/>
               </w:rPr>
-              <w:t xml:space="preserve"/>
+              <w:t xml:space="preserve">Accepted as suggested.</w:t>
+            </w:r>
+          </w:p>
+          <w:p>
+            <w:pPr>
+              <w:keepNext w:val="false"/>
+              <w:keepLines/>
+              <w:spacing w:after="40"/>
+            </w:pPr>
+            <w:r>
+              <w:rPr>
+                <w:rFonts w:ascii="Calibri" w:cs="Calibri" w:eastAsia="Calibri" w:hAnsi="Calibri"/>
+                <w:b w:val="false"/>
+                <w:bCs w:val="false"/>
+                <w:sz w:val="20"/>
+                <w:szCs w:val="20"/>
+              </w:rPr>
+              <w:t xml:space="preserve">Agreed: Rate limits move to Redis and BullMQ starts with the first background job. Request logs never record search locations (Specification Section 15.2).</w:t>
+            </w:r>
+          </w:p>
+          <w:p>
+            <w:pPr>
+              <w:keepNext w:val="false"/>
+              <w:keepLines/>
+              <w:spacing w:after="40"/>
+            </w:pPr>
+            <w:r>
+              <w:rPr>
+                <w:rFonts w:ascii="Calibri" w:cs="Calibri" w:eastAsia="Calibri" w:hAnsi="Calibri"/>
+                <w:b w:val="false"/>
+                <w:bCs w:val="false"/>
+                <w:sz w:val="20"/>
+                <w:szCs w:val="20"/>
+              </w:rPr>
+              <w:t xml:space="preserve">Decided by Emmanuel on 23 October 2026. Recorded in the Decisions Log as decision 59.</w:t>
             </w:r>
           </w:p>
         </w:tc>
@@ -14123,7 +15588,7 @@
           <w:sz w:val="22"/>
           <w:szCs w:val="22"/>
         </w:rPr>
-        <w:t xml:space="preserve">You decide each finding (in the yellow rows, or by number in chat).</w:t>
+        <w:t xml:space="preserve">The email step (decisions 35 to 38) is built next.</w:t>
       </w:r>
     </w:p>
     <w:p>
@@ -14141,7 +15606,7 @@
           <w:sz w:val="22"/>
           <w:szCs w:val="22"/>
         </w:rPr>
-        <w:t xml:space="preserve">Each decision is recorded in the Decisions Log and, where needed, the API design and status note are updated, before any code that depends on it.</w:t>
+        <w:t xml:space="preserve">Then the screen designs in Figma for your review and approval (decision 42); no app screen is built until its design is approved.</w:t>
       </w:r>
     </w:p>
     <w:p>
@@ -14159,25 +15624,7 @@
           <w:sz w:val="22"/>
           <w:szCs w:val="22"/>
         </w:rPr>
-        <w:t xml:space="preserve">Then the email step (decisions 35 to 38), then step 3 (verification ladder and identity checks).</w:t>
-      </w:r>
-    </w:p>
-    <w:p>
-      <w:pPr>
-        <w:pStyle w:val="ListParagraph"/>
-        <w:numPr>
-          <w:ilvl w:val="0"/>
-          <w:numId w:val="2"/>
-        </w:numPr>
-        <w:spacing w:after="80"/>
-      </w:pPr>
-      <w:r>
-        <w:rPr>
-          <w:rFonts w:ascii="Calibri" w:cs="Calibri" w:eastAsia="Calibri" w:hAnsi="Calibri"/>
-          <w:sz w:val="22"/>
-          <w:szCs w:val="22"/>
-        </w:rPr>
-        <w:t xml:space="preserve">This document is kept in the code repository (docs/reviews) so the findings are not lost.</w:t>
+        <w:t xml:space="preserve">The other decisions are built in the Release 1 steps named in each one, as set out in the status note (docs/STATUS.md).</w:t>
       </w:r>
     </w:p>
     <w:p>

</xml_diff>

<commit_message>
Record decision 67: screen designs in Penpot instead of Figma
Decisions Log (both copies), finding 4 in the specification check report,
STATUS.md (Figma item removed; step 2c unblocked), DEPLOYMENT.md (Penpot
account and connector; Figma no longer needed), docs/designs.md (new list
of designs) and docs/README.md.

Co-Authored-By: Claude Opus 5.5 <noreply@anthropic.com>
Claude-Session: https://claude.ai/code/session_01QEVs5DsHdDxpHJsp9WjrLL
</commit_message>
<xml_diff>
--- a/docs/reviews/2026-10-22_FindHouseQuick_Specification_Check.docx
+++ b/docs/reviews/2026-10-22_FindHouseQuick_Specification_Check.docx
@@ -6298,6 +6298,23 @@
                 <w:szCs w:val="20"/>
               </w:rPr>
               <w:t xml:space="preserve">Decided by Emmanuel on 23 October 2026. Recorded in the Decisions Log as decision 42.</w:t>
+            </w:r>
+          </w:p>
+          <w:p>
+            <w:pPr>
+              <w:keepNext w:val="false"/>
+              <w:keepLines/>
+              <w:spacing w:after="40"/>
+            </w:pPr>
+            <w:r>
+              <w:rPr>
+                <w:rFonts w:ascii="Calibri" w:cs="Calibri" w:eastAsia="Calibri" w:hAnsi="Calibri"/>
+                <w:b w:val="false"/>
+                <w:bCs w:val="false"/>
+                <w:sz w:val="20"/>
+                <w:szCs w:val="20"/>
+              </w:rPr>
+              <w:t xml:space="preserve">Changed in part on 23 October 2026 by decision 67: the designs are made in Penpot through its connector instead of Figma (Figma needs a paid seat), with Claude's Design artifact type as the fallback.</w:t>
             </w:r>
           </w:p>
         </w:tc>

</xml_diff>